<commit_message>
Clarify fixed-weight improvement definitions, environment feedback and evaluation protocols; supplement E644–E668 and D436–D445 with SR2 audit and 59 evaluation rows
</commit_message>
<xml_diff>
--- a/notes/2026-09-30-self-improvement-agent-acceleration-review-zh.docx
+++ b/notes/2026-09-30-self-improvement-agent-acceleration-review-zh.docx
@@ -60,6 +60,53 @@
           <w:rFonts/>
         </w:rPr>
         <w:t xml:space="preserve"> 从轨迹提炼经验、生成程序技能、探索页面或环境、自动修改 harness，都已经有人做过。一些工作还报告了实际费用下降，并计入了技能构造的摊销。我们的下一步应比较具体机制在目标工作流中的净收益，不能把“历史经验让 Agent 越用越快”本身作为新颖性。</w:t>
+      </w:r>
+    </w:p>
+    <w:p>
+      <w:r>
+        <w:rPr>
+          <w:rFonts/>
+        </w:rPr>
+        <w:t>本次修订补充问题定义与符号、环境规律和反馈机制的区别、无权重的数据生成分支、评测目录筛查，以及已有方法验证与候选新问题的分界。下文明确区分三类表达：</w:t>
+      </w:r>
+      <w:r>
+        <w:rPr>
+          <w:rFonts/>
+          <w:b/>
+        </w:rPr>
+        <w:t>原文定义</w:t>
+      </w:r>
+      <w:r>
+        <w:rPr>
+          <w:rFonts/>
+        </w:rPr>
+        <w:t>来自论文公式或算法；</w:t>
+      </w:r>
+      <w:r>
+        <w:rPr>
+          <w:rFonts/>
+          <w:b/>
+        </w:rPr>
+        <w:t>本文改写</w:t>
+      </w:r>
+      <w:r>
+        <w:rPr>
+          <w:rFonts/>
+        </w:rPr>
+        <w:t>只用于统一解释，不能冒充作者公式；</w:t>
+      </w:r>
+      <w:r>
+        <w:rPr>
+          <w:rFonts/>
+          <w:b/>
+        </w:rPr>
+        <w:t>本文判断</w:t>
+      </w:r>
+      <w:r>
+        <w:rPr>
+          <w:rFonts/>
+        </w:rPr>
+        <w:t>是对证据边界和研究价值的分析。限制若未明确标为“作者自述”，均应理解为本文的证据解释，而非作者已经承认的结论。</w:t>
       </w:r>
     </w:p>
     <w:p>
@@ -741,7 +788,7 @@
         <w:rPr>
           <w:rFonts/>
         </w:rPr>
-        <w:t>三种速度必须分账</w:t>
+        <w:t>用定义区分系统配置 执行轨迹和持久改进</w:t>
       </w:r>
     </w:p>
     <w:p>
@@ -749,46 +796,48 @@
         <w:rPr>
           <w:rFonts/>
         </w:rPr>
-        <w:t>第一种是</w:t>
-      </w:r>
-      <w:r>
-        <w:rPr>
-          <w:rFonts/>
-          <w:b/>
-        </w:rPr>
-        <w:t>改进过程的效率</w:t>
-      </w:r>
-      <w:r>
-        <w:rPr>
-          <w:rFonts/>
-        </w:rPr>
-        <w:t>：用更少候选、样本或 CPU 小时找到更好的 Agent。HGM、GEPA、HarnessFix 有这类结果。第二种是</w:t>
-      </w:r>
-      <w:r>
-        <w:rPr>
-          <w:rFonts/>
-          <w:b/>
-        </w:rPr>
-        <w:t>改进后的执行效率</w:t>
-      </w:r>
-      <w:r>
-        <w:rPr>
-          <w:rFonts/>
-        </w:rPr>
-        <w:t>：部署时完成同类任务更快或更便宜，SpeedRunner、MobileGPT、StarHarness 的部分实验属于这里。第三种是</w:t>
-      </w:r>
-      <w:r>
-        <w:rPr>
-          <w:rFonts/>
-          <w:b/>
-        </w:rPr>
-        <w:t>全流程净收益</w:t>
-      </w:r>
-      <w:r>
-        <w:rPr>
-          <w:rFonts/>
-        </w:rPr>
-        <w:t>：执行节省超过探索、生成、验证、检索、失败回退与维护的总投入。</w:t>
+        <w:t>综述§3的原式将Agent记为花体A，并写成模型与外部系统的二元组。为避免字体混淆，本文重命名为</w:t>
+      </w:r>
+      <w:r>
+        <w:rPr>
+          <w:rFonts w:ascii="Consolas" w:hAnsi="Consolas"/>
+          <w:sz w:val="21"/>
+        </w:rPr>
+        <w:t>Agent_t = (θ_t, Σ_t)</w:t>
+      </w:r>
+      <w:r>
+        <w:rPr>
+          <w:rFonts/>
+        </w:rPr>
+        <w:t>，其中</w:t>
+      </w:r>
+      <w:r>
+        <w:rPr>
+          <w:rFonts w:ascii="Consolas" w:hAnsi="Consolas"/>
+          <w:sz w:val="21"/>
+        </w:rPr>
+        <w:t>Σ_t = (p_t, m_t, Tools_t, g_t)</w:t>
+      </w:r>
+      <w:r>
+        <w:rPr>
+          <w:rFonts/>
+        </w:rPr>
+        <w:t>：θ是模型神经参数，p是提示，m是记忆及其检索更新机制，Tools是工具及接口，g是路由、调度等控制逻辑。运行中的观察、临时计划、短期上下文属于暂态X；同一θ在不同Σ和X下仍会产生不同的动作分布。</w:t>
+      </w:r>
+      <w:hyperlink r:id="rId11">
+        <w:r>
+          <w:rPr>
+            <w:rFonts w:ascii="Arial" w:hAnsi="Arial" w:eastAsia="Songti SC"/>
+            <w:color w:val="185A8D"/>
+          </w:rPr>
+          <w:t>[1]</w:t>
+        </w:r>
+      </w:hyperlink>
+      <w:r>
+        <w:rPr>
+          <w:rFonts/>
+        </w:rPr>
+        <w:t>，§3.1、式(1)–(3)</w:t>
       </w:r>
     </w:p>
     <w:p>
@@ -796,7 +845,208 @@
         <w:rPr>
           <w:rFonts/>
         </w:rPr>
-        <w:t>这三种结果不能互换。ACE 的适配时间明显下降，但独立部署统计的输入 token 增加；Meta-TTL 调用次数少于静态 Agent，但六次任务会话的总时间更长。我们最终应追求第三种，同时分别报告前两种，才能知道收益来自哪里。</w:t>
+        <w:t>将原文式(4)、(6)写成易读的两步形式，</w:t>
+      </w:r>
+      <w:r>
+        <w:rPr>
+          <w:rFonts/>
+          <w:b/>
+        </w:rPr>
+        <w:t>本文改写</w:t>
+      </w:r>
+      <w:r>
+        <w:rPr>
+          <w:rFonts/>
+        </w:rPr>
+        <w:t>为：</w:t>
+      </w:r>
+      <w:r>
+        <w:rPr>
+          <w:rFonts w:ascii="Consolas" w:hAnsi="Consolas"/>
+          <w:sz w:val="21"/>
+        </w:rPr>
+        <w:t>S_t = ExecuteAndEvaluate(Agent_t, Context_t)</w:t>
+      </w:r>
+      <w:r>
+        <w:rPr>
+          <w:rFonts/>
+        </w:rPr>
+        <w:t>，</w:t>
+      </w:r>
+      <w:r>
+        <w:rPr>
+          <w:rFonts w:ascii="Consolas" w:hAnsi="Consolas"/>
+          <w:sz w:val="21"/>
+        </w:rPr>
+        <w:t>Σ_(t+1) = Update(Σ_1…Σ_t, S_t)</w:t>
+      </w:r>
+      <w:r>
+        <w:rPr>
+          <w:rFonts/>
+        </w:rPr>
+        <w:t>，并保持</w:t>
+      </w:r>
+      <w:r>
+        <w:rPr>
+          <w:rFonts w:ascii="Consolas" w:hAnsi="Consolas"/>
+          <w:sz w:val="21"/>
+        </w:rPr>
+        <w:t>θ_(t+1)=θ_t</w:t>
+      </w:r>
+      <w:r>
+        <w:rPr>
+          <w:rFonts/>
+        </w:rPr>
+        <w:t>。S_t可以包含真实轨迹、成败、程序检查、文字批评和费用；Context_t是任务或部署上下文，</w:t>
+      </w:r>
+      <w:r>
+        <w:rPr>
+          <w:rFonts/>
+          <w:b/>
+        </w:rPr>
+        <w:t>不是成本</w:t>
+      </w:r>
+      <w:r>
+        <w:rPr>
+          <w:rFonts/>
+        </w:rPr>
+        <w:t>。Update产生可在后续使用、也可撤销的持久更新。一次任务内多想几步、却没有保留任何改进产物，不能自动算作这种跨任务自改进。</w:t>
+      </w:r>
+    </w:p>
+    <w:p>
+      <w:r>
+        <w:rPr>
+          <w:rFonts/>
+        </w:rPr>
+        <w:t>这个定义不要求反馈全由模型自行产生：环境结果、测试程序、事先设定的规则都可以参与；也不保证每次更新后表现单调上升。“改进”描述的是机制和目标，实际可能回归。全scaffold可修改也不等于改进器本身已经递归变强。我们的(a)主要限定</w:t>
+      </w:r>
+      <w:r>
+        <w:rPr>
+          <w:rFonts/>
+          <w:b/>
+        </w:rPr>
+        <w:t>信号来源为历史轨迹</w:t>
+      </w:r>
+      <w:r>
+        <w:rPr>
+          <w:rFonts/>
+        </w:rPr>
+        <w:t>，(b)主要限定</w:t>
+      </w:r>
+      <w:r>
+        <w:rPr>
+          <w:rFonts/>
+          <w:b/>
+        </w:rPr>
+        <w:t>通过主动交互获取环境知识</w:t>
+      </w:r>
+      <w:r>
+        <w:rPr>
+          <w:rFonts/>
+        </w:rPr>
+        <w:t>；prompt/memory/tool/harness则限定更新对象，是另一条分类轴，不能把它们排成互斥类别。</w:t>
+      </w:r>
+    </w:p>
+    <w:p>
+      <w:r>
+        <w:rPr>
+          <w:rFonts/>
+        </w:rPr>
+        <w:t>综述§8.1还要求看整个改进过程。其式(26)可重命名为</w:t>
+      </w:r>
+      <w:r>
+        <w:rPr>
+          <w:rFonts w:ascii="Consolas" w:hAnsi="Consolas"/>
+          <w:sz w:val="21"/>
+        </w:rPr>
+        <w:t>q_t = E[Φ(x, τ)]</w:t>
+      </w:r>
+      <w:r>
+        <w:rPr>
+          <w:rFonts/>
+        </w:rPr>
+        <w:t>：x来自留出任务分布，τ由第t版Agent执行产生，Φ是评价器，q_t是期望任务表现；正文另限制累计预算b_t不超过B。它没有直接最小化执行时间，也没有自动计入所有建设费用。我们需要同时观察q_t、累计花费与未来执行节省，而不能只挑最好的一版截图。</w:t>
+      </w:r>
+      <w:hyperlink r:id="rId11">
+        <w:r>
+          <w:rPr>
+            <w:rFonts w:ascii="Arial" w:hAnsi="Arial" w:eastAsia="Songti SC"/>
+            <w:color w:val="185A8D"/>
+          </w:rPr>
+          <w:t>[1]</w:t>
+        </w:r>
+      </w:hyperlink>
+      <w:r>
+        <w:rPr>
+          <w:rFonts/>
+        </w:rPr>
+        <w:t>，§8.1</w:t>
+      </w:r>
+    </w:p>
+    <w:p>
+      <w:pPr>
+        <w:pStyle w:val="Heading2"/>
+      </w:pPr>
+      <w:r>
+        <w:rPr>
+          <w:rFonts/>
+        </w:rPr>
+        <w:t>三种速度必须分账</w:t>
+      </w:r>
+    </w:p>
+    <w:p>
+      <w:r>
+        <w:rPr>
+          <w:rFonts/>
+        </w:rPr>
+        <w:t>第一种是</w:t>
+      </w:r>
+      <w:r>
+        <w:rPr>
+          <w:rFonts/>
+          <w:b/>
+        </w:rPr>
+        <w:t>改进过程的效率</w:t>
+      </w:r>
+      <w:r>
+        <w:rPr>
+          <w:rFonts/>
+        </w:rPr>
+        <w:t>：用更少候选、样本或 CPU 小时找到更好的 Agent。HGM、GEPA、HarnessFix 有这类结果。第二种是</w:t>
+      </w:r>
+      <w:r>
+        <w:rPr>
+          <w:rFonts/>
+          <w:b/>
+        </w:rPr>
+        <w:t>改进后的执行效率</w:t>
+      </w:r>
+      <w:r>
+        <w:rPr>
+          <w:rFonts/>
+        </w:rPr>
+        <w:t>：部署时完成同类任务更快或更便宜，SpeedRunner、MobileGPT、StarHarness 的部分实验属于这里。第三种是</w:t>
+      </w:r>
+      <w:r>
+        <w:rPr>
+          <w:rFonts/>
+          <w:b/>
+        </w:rPr>
+        <w:t>全流程净收益</w:t>
+      </w:r>
+      <w:r>
+        <w:rPr>
+          <w:rFonts/>
+        </w:rPr>
+        <w:t>：执行节省超过探索、生成、验证、检索、失败回退与维护的总投入。</w:t>
+      </w:r>
+    </w:p>
+    <w:p>
+      <w:r>
+        <w:rPr>
+          <w:rFonts/>
+        </w:rPr>
+        <w:t>这三种结果不能互换。ACE 的适配时间明显下降，但独立部署统计的输入 token 增加；Meta-TTL 调用次数少于静态 Agent，但每个含六个episode的Jericho会话总时间更长。我们最终应追求第三种，同时分别报告前两种，才能知道收益来自哪里。</w:t>
       </w:r>
     </w:p>
     <w:p>
@@ -845,7 +1095,28 @@
         <w:rPr>
           <w:rFonts/>
         </w:rPr>
-        <w:t>我们先逐行做范围筛查，再对直接影响研究判断的工作读方法、评估协议、结果表及相关附录。筛查表明确区分“原文深读”“原文选读”和“目录级待核”，没有把未读全文的条目包装成否定结论。253条中，15条列为直接效率候选、47条为方法参考、63条为背景、70条按范围排除、17条重复、41条仍待核；这些是目录行标签，既不是质量排名，也不是全文阅读数量。网站另列的评测资源不包含在上述253条计数中；这也不是宣称覆盖综述的每一条参考文献。正文重点比较约三十余项方法，完整逐项结果与分支证据笔记随报告保存。</w:t>
+        <w:t>我们先逐行做范围筛查，再对直接影响研究判断的工作读方法、评估协议、结果表及相关附录。筛查表明确区分“原文深读”“原文选读”和“目录级待核”，没有把未读全文的条目包装成否定结论。253条中，15条列为直接效率候选、47条为方法参考、63条为背景、70条按范围排除、17条重复、41条仍待核；这些是目录行标签，既不是质量排名，也不是全文阅读数量。正文重点比较约三十余项方法，完整逐项结果与分支证据笔记随报告保存。</w:t>
+      </w:r>
+    </w:p>
+    <w:p>
+      <w:r>
+        <w:rPr>
+          <w:rFonts/>
+        </w:rPr>
+        <w:t>本次补筛网站另列的</w:t>
+      </w:r>
+      <w:r>
+        <w:rPr>
+          <w:rFonts/>
+          <w:b/>
+        </w:rPr>
+        <w:t>59条评测目录记录</w:t>
+      </w:r>
+      <w:r>
+        <w:rPr>
+          <w:rFonts/>
+        </w:rPr>
+        <w:t>：按主链接去重只有45个不同链接，14条是额外重复记录，其中还包含judge、平台及题名错链。方法与评测共312行，不能说成312篇独立、有效、已全文读完的论文。12篇重点评测原文另核任务、重置、反馈和指标协议，其余评测行仅做范围筛查。原目录“ClawBench”链接2601.08613实际指向磁性纳米线论文；通过作者官方仓库更正为2604.08523v2，原错链保留在索引供审计。综述正文§1–10已通读并重点核§3、6、7.2、7.6、8、9；没有逐篇展开其全部参考文献。</w:t>
       </w:r>
     </w:p>
     <w:p>
@@ -952,6 +1223,75 @@
         <w:rPr>
           <w:rFonts/>
         </w:rPr>
+        <w:t>按原文§2、式(4)–(11)简化并重命名符号，这个过程可以写成：</w:t>
+      </w:r>
+      <w:r>
+        <w:rPr>
+          <w:rFonts w:ascii="Consolas" w:hAnsi="Consolas"/>
+          <w:sz w:val="21"/>
+        </w:rPr>
+        <w:t>g_y = Critique(y, L)</w:t>
+      </w:r>
+      <w:r>
+        <w:rPr>
+          <w:rFonts/>
+        </w:rPr>
+        <w:t>，</w:t>
+      </w:r>
+      <w:r>
+        <w:rPr>
+          <w:rFonts w:ascii="Consolas" w:hAnsi="Consolas"/>
+          <w:sz w:val="21"/>
+        </w:rPr>
+        <w:t>g_x = Backward(x, y, g_y)</w:t>
+      </w:r>
+      <w:r>
+        <w:rPr>
+          <w:rFonts/>
+        </w:rPr>
+        <w:t>，</w:t>
+      </w:r>
+      <w:r>
+        <w:rPr>
+          <w:rFonts w:ascii="Consolas" w:hAnsi="Consolas"/>
+          <w:sz w:val="21"/>
+        </w:rPr>
+        <w:t>x_new = Edit(x, g_x)</w:t>
+      </w:r>
+      <w:r>
+        <w:rPr>
+          <w:rFonts/>
+        </w:rPr>
+        <w:t>。这里x是可编辑提示或代码，y是下游输出，L是任务评价，g_y与g_x都是文字反馈；Backward还读取节点关系和上下文。多条下游路径的反馈会汇集，再指导编辑。这是</w:t>
+      </w:r>
+      <w:r>
+        <w:rPr>
+          <w:rFonts/>
+          <w:b/>
+        </w:rPr>
+        <w:t>本文对作者算法的改写</w:t>
+      </w:r>
+      <w:r>
+        <w:rPr>
+          <w:rFonts/>
+        </w:rPr>
+        <w:t>：没有对字符串做数值减法，也没有从文本中恢复模型权重的梯度。有效性最终依靠修改后的独立执行结果，而不依靠“梯度”这个名称。</w:t>
+      </w:r>
+      <w:hyperlink r:id="rId15">
+        <w:r>
+          <w:rPr>
+            <w:rFonts w:ascii="Arial" w:hAnsi="Arial" w:eastAsia="Songti SC"/>
+            <w:color w:val="185A8D"/>
+          </w:rPr>
+          <w:t>[2]</w:t>
+        </w:r>
+      </w:hyperlink>
+    </w:p>
+    <w:p>
+      <w:r>
+        <w:rPr>
+          <w:rFonts/>
+        </w:rPr>
         <w:t>以我们的问题作一个说明性例子：失败轨迹显示“日期跨月时选择了错误报销周期”。反馈可以沿执行链定位到日期计算的代码或提示，提出补充边界条件、调用日期函数的修改；随后仍要运行独立测试，判断是否修复。这个例子是我们的应用解释，不是 TextGrad 论文里的业务实验。它提供了 A 方向的候选生成方式，并不单独证明加速。</w:t>
       </w:r>
     </w:p>
@@ -979,6 +1319,81 @@
       </w:r>
     </w:p>
     <w:p>
+      <w:r>
+        <w:rPr>
+          <w:rFonts/>
+        </w:rPr>
+        <w:t>Trace的</w:t>
+      </w:r>
+      <w:r>
+        <w:rPr>
+          <w:rFonts/>
+          <w:b/>
+        </w:rPr>
+        <w:t>原文问题定义</w:t>
+      </w:r>
+      <w:r>
+        <w:rPr>
+          <w:rFonts/>
+        </w:rPr>
+        <w:t>是OPTO三元组</w:t>
+      </w:r>
+      <w:r>
+        <w:rPr>
+          <w:rFonts w:ascii="Consolas" w:hAnsi="Consolas"/>
+          <w:sz w:val="21"/>
+        </w:rPr>
+        <w:t>(Θ, ω, T)</w:t>
+      </w:r>
+      <w:r>
+        <w:rPr>
+          <w:rFonts/>
+        </w:rPr>
+        <w:t>：Θ为可编辑变量空间，ω为固定问题描述，T为提供执行信息的oracle。每轮选择θ∈Θ，得到</w:t>
+      </w:r>
+      <w:r>
+        <w:rPr>
+          <w:rFonts w:ascii="Consolas" w:hAnsi="Consolas"/>
+          <w:sz w:val="21"/>
+        </w:rPr>
+        <w:t>τ=(f,g)</w:t>
+      </w:r>
+      <w:r>
+        <w:rPr>
+          <w:rFonts/>
+        </w:rPr>
+        <w:t>，其中g是实际执行DAG，f是某个输出节点的反馈，再据此更新θ。此处θ可以是Python代码或prompt，</w:t>
+      </w:r>
+      <w:r>
+        <w:rPr>
+          <w:rFonts/>
+          <w:b/>
+        </w:rPr>
+        <w:t>不必是模型权重</w:t>
+      </w:r>
+      <w:r>
+        <w:rPr>
+          <w:rFonts/>
+        </w:rPr>
+        <w:t>；f也可以是异常日志或文字批评，作者没有要求每个问题都有一个可微的标量loss。原文§3.2明确讨论了执行图抽象粒度的取舍：过细使图复杂，过粗又丢失定位信息。这正是我们做轨迹诊断时需要验证的表示选择。</w:t>
+      </w:r>
+      <w:hyperlink r:id="rId16">
+        <w:r>
+          <w:rPr>
+            <w:rFonts w:ascii="Arial" w:hAnsi="Arial" w:eastAsia="Songti SC"/>
+            <w:color w:val="185A8D"/>
+          </w:rPr>
+          <w:t>[3]</w:t>
+        </w:r>
+      </w:hyperlink>
+      <w:r>
+        <w:rPr>
+          <w:rFonts/>
+        </w:rPr>
+        <w:t>，§§2.1、3.2</w:t>
+      </w:r>
+    </w:p>
+    <w:p>
       <w:pPr>
         <w:pStyle w:val="Heading2"/>
       </w:pPr>
@@ -1082,6 +1497,111 @@
       </w:r>
     </w:p>
     <w:p>
+      <w:r>
+        <w:rPr>
+          <w:rFonts/>
+        </w:rPr>
+        <w:t>两篇论文的目标也需要分清。</w:t>
+      </w:r>
+      <w:r>
+        <w:rPr>
+          <w:rFonts/>
+          <w:b/>
+        </w:rPr>
+        <w:t>GEPA原文式(2)在固定模型权重条件下的改写</w:t>
+      </w:r>
+      <w:r>
+        <w:rPr>
+          <w:rFonts/>
+        </w:rPr>
+        <w:t>是：</w:t>
+      </w:r>
+      <w:r>
+        <w:rPr>
+          <w:rFonts w:ascii="Consolas" w:hAnsi="Consolas"/>
+          <w:sz w:val="21"/>
+        </w:rPr>
+        <w:t>Π* = argmax_Π E[μ(Φ(x; Π, Θ_fixed), m)]</w:t>
+      </w:r>
+      <w:r>
+        <w:rPr>
+          <w:rFonts/>
+        </w:rPr>
+        <w:t>，受rollout预算B约束。Φ是由多个模块组成的系统，Π是各模块提示，Θ_fixed是冻结权重，x是任务输入，m是标准答案、rubric或测试等评价资料，μ是任务得分；期望取自任务分布。B限制优化时的执行与评价次数，目标里没有部署时间或费用惩罚。</w:t>
+      </w:r>
+      <w:hyperlink r:id="rId17">
+        <w:r>
+          <w:rPr>
+            <w:rFonts w:ascii="Arial" w:hAnsi="Arial" w:eastAsia="Songti SC"/>
+            <w:color w:val="185A8D"/>
+          </w:rPr>
+          <w:t>[4]</w:t>
+        </w:r>
+      </w:hyperlink>
+      <w:r>
+        <w:rPr>
+          <w:rFonts/>
+        </w:rPr>
+        <w:t>，§2</w:t>
+      </w:r>
+    </w:p>
+    <w:p>
+      <w:r>
+        <w:rPr>
+          <w:rFonts/>
+          <w:b/>
+        </w:rPr>
+        <w:t>SkillOpt原文式(1)–(3)</w:t>
+      </w:r>
+      <w:r>
+        <w:rPr>
+          <w:rFonts/>
+        </w:rPr>
+        <w:t>则把固定模型M和harness h执行任务x、读取skill s得到的轨迹与奖励写成</w:t>
+      </w:r>
+      <w:r>
+        <w:rPr>
+          <w:rFonts w:ascii="Consolas" w:hAnsi="Consolas"/>
+          <w:sz w:val="21"/>
+        </w:rPr>
+        <w:t>(τ, r_x(s)) = h(M,x,s)</w:t>
+      </w:r>
+      <w:r>
+        <w:rPr>
+          <w:rFonts/>
+        </w:rPr>
+        <w:t>；我们给r补上x下标以免混淆不同任务。开发集产生候选集合C，选择集决定</w:t>
+      </w:r>
+      <w:r>
+        <w:rPr>
+          <w:rFonts w:ascii="Consolas" w:hAnsi="Consolas"/>
+          <w:sz w:val="21"/>
+        </w:rPr>
+        <w:t xml:space="preserve"> s* = argmax_{s∈C} 平均_{x∈D_sel} r_x(s)</w:t>
+      </w:r>
+      <w:r>
+        <w:rPr>
+          <w:rFonts/>
+        </w:rPr>
+        <w:t>，最终只在D_test报告结果。每轮“learning rate”是允许增加、删除、替换的文字编辑预算，不是权重学习率。两者都能帮助我们生成更好的策略，但若目标是加速，还必须另外记录资源代价，不能把奖励上升等同于速度上升。</w:t>
+      </w:r>
+      <w:hyperlink r:id="rId18">
+        <w:r>
+          <w:rPr>
+            <w:rFonts w:ascii="Arial" w:hAnsi="Arial" w:eastAsia="Songti SC"/>
+            <w:color w:val="185A8D"/>
+          </w:rPr>
+          <w:t>[5]</w:t>
+        </w:r>
+      </w:hyperlink>
+      <w:r>
+        <w:rPr>
+          <w:rFonts/>
+        </w:rPr>
+        <w:t>，§3</w:t>
+      </w:r>
+    </w:p>
+    <w:p>
       <w:pPr>
         <w:pStyle w:val="Heading2"/>
       </w:pPr>
@@ -1133,7 +1653,56 @@
         <w:rPr>
           <w:rFonts/>
         </w:rPr>
-        <w:t>Meta-TTL 进一步学习“怎样根据经历改进”：外循环搜索 meta-prompt，内循环依据它在每次尝试后改 actor prompt。最终固定 meta-prompt，在未见任务或域上测试跨次尝试的适应。主方法两层都不改模型权重，适合解释为什么无训练系统仍能“学会如何学习”。</w:t>
+        <w:t>ACE的主方法不是数值梯度优化。可用</w:t>
+      </w:r>
+      <w:r>
+        <w:rPr>
+          <w:rFonts/>
+          <w:b/>
+        </w:rPr>
+        <w:t>本文算法改写</w:t>
+      </w:r>
+      <w:r>
+        <w:rPr>
+          <w:rFonts/>
+        </w:rPr>
+        <w:t>概括为</w:t>
+      </w:r>
+      <w:r>
+        <w:rPr>
+          <w:rFonts w:ascii="Consolas" w:hAnsi="Consolas"/>
+          <w:sz w:val="21"/>
+        </w:rPr>
+        <w:t>m_new = Dedup(Merge(m, Δ))</w:t>
+      </w:r>
+      <w:r>
+        <w:rPr>
+          <w:rFonts/>
+        </w:rPr>
+        <w:t>：m是带ID和使用统计的playbook，Δ是反思后由curator产生的局部条目更新，Merge应用更新，Dedup处理冗余。其核心研究对象是经验如何增量维护；这与检索时挑选哪条经验、执行时如何把它转成动作是不同问题。</w:t>
+      </w:r>
+      <w:hyperlink r:id="rId19">
+        <w:r>
+          <w:rPr>
+            <w:rFonts w:ascii="Arial" w:hAnsi="Arial" w:eastAsia="Songti SC"/>
+            <w:color w:val="185A8D"/>
+          </w:rPr>
+          <w:t>[6]</w:t>
+        </w:r>
+      </w:hyperlink>
+      <w:r>
+        <w:rPr>
+          <w:rFonts/>
+        </w:rPr>
+        <w:t>，§3</w:t>
+      </w:r>
+    </w:p>
+    <w:p>
+      <w:r>
+        <w:rPr>
+          <w:rFonts/>
+        </w:rPr>
+        <w:t>Meta-TTL 进一步学习“怎样根据经历改进”：外循环搜索 meta-prompt，内循环依据它在每次尝试后改 actor prompt，下一次episode重置任务环境但保留改进后的提示。最终固定meta-prompt评估适应能力；Jericho的域内评估仍使用meta-training阶段的游戏，WebArena-lite和τ²的域内评估使用留出实例，另设域外评估，不能统称全部为未见任务。主方法两层都不改模型权重。</w:t>
       </w:r>
       <w:hyperlink r:id="rId12">
         <w:r>
@@ -1148,15 +1717,48 @@
         <w:rPr>
           <w:rFonts/>
         </w:rPr>
-        <w:t>，§3</w:t>
+        <w:t>，§§3、4.1</w:t>
       </w:r>
     </w:p>
     <w:p>
       <w:r>
         <w:rPr>
           <w:rFonts/>
-        </w:rPr>
-        <w:t>不过其每个含六次episode的Jericho会话，三次运行平均从静态基线593.2秒、196K tokens，变成860.9秒、364K tokens；调用数却从231降到204。它比若干昂贵的自改进基线快，但比不改进更慢。每个 benchmark 另有约30–70美元离线 meta-search。论文主要证据是加权学习曲线与跨域表现，而不是执行净收益。</w:t>
+          <w:b/>
+        </w:rPr>
+        <w:t>Meta-TTL原文式(1)–(4)</w:t>
+      </w:r>
+      <w:r>
+        <w:rPr>
+          <w:rFonts/>
+        </w:rPr>
+        <w:t>的核心是</w:t>
+      </w:r>
+      <w:r>
+        <w:rPr>
+          <w:rFonts w:ascii="Consolas" w:hAnsi="Consolas"/>
+          <w:sz w:val="21"/>
+        </w:rPr>
+        <w:t>W-AUC = Σ_k k·J(τ_k) / Σ_k k·J_max(g)</w:t>
+      </w:r>
+      <w:r>
+        <w:rPr>
+          <w:rFonts/>
+        </w:rPr>
+        <w:t>，外循环最大化训练任务上的期望W-AUC。g为任务，τ_k为第k次尝试轨迹，J为回报，J_max(g)为该任务的最大回报，k从1到K。它更重视后期尝试的表现，而不是奖励更短的墙钟时间。内循环</w:t>
+      </w:r>
+      <w:r>
+        <w:rPr>
+          <w:rFonts w:ascii="Consolas" w:hAnsi="Consolas"/>
+          <w:sz w:val="21"/>
+        </w:rPr>
+        <w:t>ρ_(k+1) ~ f_φ(· | ρ_k,H_k)</w:t>
+      </w:r>
+      <w:r>
+        <w:rPr>
+          <w:rFonts/>
+        </w:rPr>
+        <w:t>中，ρ是actor prompt，H_k是此前尝试历史，φ是控制改进器的文字meta-prompt；φ也不是神经网络权重。</w:t>
       </w:r>
       <w:hyperlink r:id="rId12">
         <w:r>
@@ -1167,6 +1769,23 @@
           <w:t>[7]</w:t>
         </w:r>
       </w:hyperlink>
+    </w:p>
+    <w:p>
+      <w:r>
+        <w:rPr>
+          <w:rFonts/>
+        </w:rPr>
+        <w:t>不过其每个含六次episode的Jericho会话，三次运行平均从静态基线593.2秒、196K tokens，变成860.9秒、364K tokens；调用数却从231降到204。它比若干昂贵的自改进基线快，但比不改进更慢。每个 benchmark 另有约30–70美元离线 meta-search。论文主要证据是加权学习曲线与跨域表现，而不是执行净收益。</w:t>
+      </w:r>
+      <w:hyperlink r:id="rId12">
+        <w:r>
+          <w:rPr>
+            <w:rFonts w:ascii="Arial" w:hAnsi="Arial" w:eastAsia="Songti SC"/>
+            <w:color w:val="185A8D"/>
+          </w:rPr>
+          <w:t>[7]</w:t>
+        </w:r>
+      </w:hyperlink>
       <w:r>
         <w:rPr>
           <w:rFonts/>
@@ -1255,7 +1874,7 @@
         <w:rPr>
           <w:rFonts/>
         </w:rPr>
-        <w:t>AWM更接近执行经验：从成功轨迹抽象子任务，参数化具体对象，存成文字workflow，运行时给Agent参考。正式ICML版本报告WebArena成功率35.5%，成功路径步数约7.9到5.9；但是主要方法仍让模型逐步执行，不能当作宏操作。附录将其改为可执行高层动作AWM-AS后，Mind2Web任务成功率从4.8%降至3.6%，尽管单步指标略升。作者将一部分问题归因于弹窗和状态变化，固定序列跳过了必要观察。</w:t>
+        <w:t>AWM更接近执行经验：从成功轨迹抽象子任务，参数化具体对象，存成文字workflow，运行时给Agent参考。正式ICML版本报告WebArena成功率35.5%，成功路径步数约7.9到5.9；但是主要方法仍让模型逐步执行，不能当作宏操作。附录将其改为可执行高层动作AWM-AS后，Mind2Web任务成功率从4.8%降至3.6%，尽管单步指标略升。作者将一部分问题归因于弹窗和状态变化，固定序列跳过了必要观察。Table13邻近文字与表值不一致，此处采用表中4.8%与3.6%。</w:t>
       </w:r>
       <w:hyperlink r:id="rId22">
         <w:r>
@@ -1270,7 +1889,7 @@
         <w:rPr>
           <w:rFonts/>
         </w:rPr>
-        <w:t>，Table1、AppD/F</w:t>
+        <w:t>，Table1、AppF Table13/Fig6</w:t>
       </w:r>
     </w:p>
     <w:p>
@@ -1301,6 +1920,109 @@
         <w:rPr>
           <w:rFonts/>
         </w:rPr>
+        <w:t>两者的</w:t>
+      </w:r>
+      <w:r>
+        <w:rPr>
+          <w:rFonts/>
+          <w:b/>
+        </w:rPr>
+        <w:t>问题定义</w:t>
+      </w:r>
+      <w:r>
+        <w:rPr>
+          <w:rFonts/>
+        </w:rPr>
+        <w:t>都是固定模型借助外部文字经验做未来任务。AWM原文§2写作</w:t>
+      </w:r>
+      <w:r>
+        <w:rPr>
+          <w:rFonts w:ascii="Consolas" w:hAnsi="Consolas"/>
+          <w:sz w:val="21"/>
+        </w:rPr>
+        <w:t>I(E)→W</w:t>
+      </w:r>
+      <w:r>
+        <w:rPr>
+          <w:rFonts/>
+        </w:rPr>
+        <w:t>、</w:t>
+      </w:r>
+      <w:r>
+        <w:rPr>
+          <w:rFonts w:ascii="Consolas" w:hAnsi="Consolas"/>
+          <w:sz w:val="21"/>
+        </w:rPr>
+        <w:t>M+W→M_w</w:t>
+      </w:r>
+      <w:r>
+        <w:rPr>
+          <w:rFonts/>
+        </w:rPr>
+        <w:t>：E是经验集合，I诱导工作流W，加入原记忆M后得到M_w，执行模型仍逐步根据观察选动作。AWM的online模式也可用LM judge；关键差别在于AWM主要从判定成功的轨迹抽工作流，ReasoningBank同时从成功与失败提炼策略，原文§3明确其运行时不依赖ground truth。后者默认更新可用</w:t>
+      </w:r>
+      <w:r>
+        <w:rPr>
+          <w:rFonts/>
+          <w:b/>
+        </w:rPr>
+        <w:t>本文改写</w:t>
+      </w:r>
+      <w:r>
+        <w:rPr>
+          <w:rFonts/>
+        </w:rPr>
+        <w:t>表示为</w:t>
+      </w:r>
+      <w:r>
+        <w:rPr>
+          <w:rFonts w:ascii="Consolas" w:hAnsi="Consolas"/>
+          <w:sz w:val="21"/>
+        </w:rPr>
+        <w:t>M_new = M_old ∪ Extract(task, trajectory, Judge结果)</w:t>
+      </w:r>
+      <w:r>
+        <w:rPr>
+          <w:rFonts/>
+        </w:rPr>
+        <w:t>；默认consolidation是追加，不能描述成已经自动证伪并删除旧规则。作者自述的不足分别包括AWM过度服从不适用工作流，以及ReasoningBank自评噪声、检索与合并机制较简单。</w:t>
+      </w:r>
+      <w:hyperlink r:id="rId22">
+        <w:r>
+          <w:rPr>
+            <w:rFonts w:ascii="Arial" w:hAnsi="Arial" w:eastAsia="Songti SC"/>
+            <w:color w:val="185A8D"/>
+          </w:rPr>
+          <w:t>[13]</w:t>
+        </w:r>
+      </w:hyperlink>
+      <w:r>
+        <w:rPr>
+          <w:rFonts/>
+        </w:rPr>
+        <w:t>，§§2、3.2；</w:t>
+      </w:r>
+      <w:hyperlink r:id="rId23">
+        <w:r>
+          <w:rPr>
+            <w:rFonts w:ascii="Arial" w:hAnsi="Arial" w:eastAsia="Songti SC"/>
+            <w:color w:val="185A8D"/>
+          </w:rPr>
+          <w:t>[14]</w:t>
+        </w:r>
+      </w:hyperlink>
+      <w:r>
+        <w:rPr>
+          <w:rFonts/>
+        </w:rPr>
+        <w:t>，§3、AppE</w:t>
+      </w:r>
+    </w:p>
+    <w:p>
+      <w:r>
+        <w:rPr>
+          <w:rFonts/>
+        </w:rPr>
         <w:t>ExpeL的经验比较与示例检索同样能改善任务表现，却增加经验上下文。ALFWorld平均动作14.82到14.30，trajectory token从2,051.49到2,856.70；这里是轨迹字符串统计，也不等于逐次API累计账单。共同的教训是：文字经验可以减少错误决策，同时让每次决策读得更多。</w:t>
       </w:r>
       <w:hyperlink r:id="rId24">
@@ -1358,6 +2080,68 @@
         <w:rPr>
           <w:rFonts/>
         </w:rPr>
+        <w:t>MemRL</w:t>
+      </w:r>
+      <w:r>
+        <w:rPr>
+          <w:rFonts/>
+          <w:b/>
+        </w:rPr>
+        <w:t>实际实现的原文式(4)</w:t>
+      </w:r>
+      <w:r>
+        <w:rPr>
+          <w:rFonts/>
+        </w:rPr>
+        <w:t>是</w:t>
+      </w:r>
+      <w:r>
+        <w:rPr>
+          <w:rFonts w:ascii="Consolas" w:hAnsi="Consolas"/>
+          <w:sz w:val="21"/>
+        </w:rPr>
+        <w:t>Q_new = Q_old + α(r − Q_old)</w:t>
+      </w:r>
+      <w:r>
+        <w:rPr>
+          <w:rFonts/>
+        </w:rPr>
+        <w:t>：Q是外部记忆条目的效用估计，α是更新步长，r是该次任务回报。先按语义相似度筛候选，再按式(7)的</w:t>
+      </w:r>
+      <w:r>
+        <w:rPr>
+          <w:rFonts w:ascii="Consolas" w:hAnsi="Consolas"/>
+          <w:sz w:val="21"/>
+        </w:rPr>
+        <w:t>score=(1−λ)·标准化相似度 + λ·标准化Q</w:t>
+      </w:r>
+      <w:r>
+        <w:rPr>
+          <w:rFonts/>
+        </w:rPr>
+        <w:t>取记忆；标准化采用z-score，λ控制两项权重。改变的是检索策略，不是LLM或环境转移模型。论文先给了一般TD式，但不能因此说实现训练了神经Q网络。作者指出长轨迹、多个记忆共享结果时的归因，以及低任务相似性和错误奖励会影响效果；给r加入时间或费用惩罚属于我们要另行验证的扩展。</w:t>
+      </w:r>
+      <w:hyperlink r:id="rId25">
+        <w:r>
+          <w:rPr>
+            <w:rFonts w:ascii="Arial" w:hAnsi="Arial" w:eastAsia="Songti SC"/>
+            <w:color w:val="185A8D"/>
+          </w:rPr>
+          <w:t>[16]</w:t>
+        </w:r>
+      </w:hyperlink>
+      <w:r>
+        <w:rPr>
+          <w:rFonts/>
+        </w:rPr>
+        <w:t>，§§3–4、6、AppG</w:t>
+      </w:r>
+    </w:p>
+    <w:p>
+      <w:r>
+        <w:rPr>
+          <w:rFonts/>
+        </w:rPr>
         <w:t>成本敏感的接纳也已有先例。SEDM提出paired A/B，按奖励增益扣除延迟或token惩罚接纳、删除经验；因此“只有划算才保留”不能作为全新原则。它的主要token优势相对G-Memory，而非无记忆，例如FEVER的输入token由G-Memory3.62M降至2.47M，但无记忆只需1.65M；反复回放的构造开销还需另计。用历史工具响应重放，也不能保证覆盖改变策略后真实环境会给出的反事实响应。</w:t>
       </w:r>
       <w:hyperlink r:id="rId26">
@@ -1415,7 +2199,20 @@
         <w:rPr>
           <w:rFonts/>
         </w:rPr>
-        <w:t>Metis将历史经验分为plans、环境facts和pitfalls。它先让文字plan被不同结构的query反复使用，达到复用条件后再生成参数化工具；并非每次成功都立即固化代码。代码通过依赖与编译检查后供后续任务调用，反思既利用失败轨迹，也利用成功但低效的轨迹。这与我们的粗略想法重合很高。</w:t>
+        <w:t>Metis将历史经验分为plans、环境facts和pitfalls。它先按文字plan在多少个任务中</w:t>
+      </w:r>
+      <w:r>
+        <w:rPr>
+          <w:rFonts/>
+          <w:b/>
+        </w:rPr>
+        <w:t>被选中</w:t>
+      </w:r>
+      <w:r>
+        <w:rPr>
+          <w:rFonts/>
+        </w:rPr>
+        <w:t>来触发程序化，这些任务不必成功；生成工具时再要求至少两个结构不同的query支持，并暴露可变参数。频繁被选中并不证明plan导致了成功。代码通过依赖与编译检查后供后续任务调用，反思既利用失败轨迹，也利用成功但低效的轨迹。</w:t>
       </w:r>
       <w:hyperlink r:id="rId28">
         <w:r>
@@ -1430,7 +2227,7 @@
         <w:rPr>
           <w:rFonts/>
         </w:rPr>
-        <w:t>，§2–3</w:t>
+        <w:t>，§2–3、Algorithm1</w:t>
       </w:r>
     </w:p>
     <w:p>
@@ -1438,7 +2235,72 @@
         <w:rPr>
           <w:rFonts/>
         </w:rPr>
-        <w:t>固定GPT-4o执行器、Sonnet4.6反思，在AppWorld官方划分中，无记忆到Metis的TGC由51.8%到60.1%，每任务执行token112.6K到97.4K，ReAct轮数14.55到11.25。另在重采样划分中，No Memory、SkillX、Metis三个方法共同完成的62题上，Metis也降低了token，减少成功题目集合不同造成的混杂。构造反思另需7.9M tokens，但排除了生成训练轨迹的成本，没有完整秒数或美元回本结论。</w:t>
+        <w:t>其</w:t>
+      </w:r>
+      <w:r>
+        <w:rPr>
+          <w:rFonts/>
+          <w:b/>
+        </w:rPr>
+        <w:t>原定义</w:t>
+      </w:r>
+      <w:r>
+        <w:rPr>
+          <w:rFonts/>
+        </w:rPr>
+        <w:t>是</w:t>
+      </w:r>
+      <w:r>
+        <w:rPr>
+          <w:rFonts w:ascii="Consolas" w:hAnsi="Consolas"/>
+          <w:sz w:val="21"/>
+        </w:rPr>
+        <w:t>M=(M_text,M_code)</w:t>
+      </w:r>
+      <w:r>
+        <w:rPr>
+          <w:rFonts/>
+        </w:rPr>
+        <w:t>、</w:t>
+      </w:r>
+      <w:r>
+        <w:rPr>
+          <w:rFonts w:ascii="Consolas" w:hAnsi="Consolas"/>
+          <w:sz w:val="21"/>
+        </w:rPr>
+        <w:t>M_text=M_env ∪ M_pit ∪ M_plan</w:t>
+      </w:r>
+      <w:r>
+        <w:rPr>
+          <w:rFonts/>
+        </w:rPr>
+        <w:t>。第k个任务后</w:t>
+      </w:r>
+      <w:r>
+        <w:rPr>
+          <w:rFonts w:ascii="Consolas" w:hAnsi="Consolas"/>
+          <w:sz w:val="21"/>
+        </w:rPr>
+        <w:t>M_k=Reflect(M_(k−1),τ_k)</w:t>
+      </w:r>
+      <w:r>
+        <w:rPr>
+          <w:rFonts/>
+        </w:rPr>
+        <w:t>；τ_k为轨迹。每条文字记忆含内容、类别和失效位，旧规则被纠正时标为失效并追加新条目。触发条件可写为</w:t>
+      </w:r>
+      <w:r>
+        <w:rPr>
+          <w:rFonts w:ascii="Consolas" w:hAnsi="Consolas"/>
+          <w:sz w:val="21"/>
+        </w:rPr>
+        <w:t>|B(p)|≥θ</w:t>
+      </w:r>
+      <w:r>
+        <w:rPr>
+          <w:rFonts/>
+        </w:rPr>
+        <w:t>，B(p)是选过计划p的任务索引集合，θ是阈值。Codifier使用plan与相关queries，刻意不输入原始候选轨迹，减少把一次具体执行硬编码进去。反思器还能访问环境调查原因，形成“观察失败—补探查—保存规则—后续检索—新证据使旧规则失效”的闭环。这已直接覆盖(a)和(b)，但文字是建议、编译通过是代码接纳条件，二者都不是业务语义的正确性证明。</w:t>
       </w:r>
       <w:hyperlink r:id="rId28">
         <w:r>
@@ -1453,6 +2315,29 @@
         <w:rPr>
           <w:rFonts/>
         </w:rPr>
+        <w:t>，§§3.2–3.5</w:t>
+      </w:r>
+    </w:p>
+    <w:p>
+      <w:r>
+        <w:rPr>
+          <w:rFonts/>
+        </w:rPr>
+        <w:t>固定GPT-4o执行器、Sonnet4.6反思，在AppWorld官方划分中，无记忆到Metis的TGC由51.8%到60.1%，每任务执行token112.6K到97.4K，ReAct轮数14.55到11.25。另在重采样划分中，No Memory、SkillX、Metis三个方法共同完成的62题上，Metis也降低了token，减少成功题目集合不同造成的混杂。构造反思另需7.9M tokens，但排除了生成训练轨迹的成本，没有完整秒数或美元回本结论。</w:t>
+      </w:r>
+      <w:hyperlink r:id="rId28">
+        <w:r>
+          <w:rPr>
+            <w:rFonts w:ascii="Arial" w:hAnsi="Arial" w:eastAsia="Songti SC"/>
+            <w:color w:val="185A8D"/>
+          </w:rPr>
+          <w:t>[17]</w:t>
+        </w:r>
+      </w:hyperlink>
+      <w:r>
+        <w:rPr>
+          <w:rFonts/>
+        </w:rPr>
         <w:t>，Tables1–2</w:t>
       </w:r>
     </w:p>
@@ -1480,7 +2365,7 @@
         <w:rPr>
           <w:rFonts/>
         </w:rPr>
-        <w:t>SpeedRunner让固定模型的actor分批执行，另一个固定模型coding agent读取历史轨迹、工具调用栈和技能版本，新增、修改或删除程序技能，区分公开工具和内部辅助函数。它主要从日志改进，不依赖重新回放环境或额外验证。因此与我们的A方向——分析trajectory再改代码——是直接近邻。</w:t>
+        <w:t>SpeedRunner让固定模型的actor分批执行，另一个固定模型coding agent读取历史轨迹、工具调用栈和技能版本，新增、修改或删除程序技能，区分公开工具和内部辅助函数。它不要求在旧环境任务上重新回放来验收技能；coding agent仍可执行代码、统计日志和做局部测试。因此它与A方向直接重合，不能将其描述成完全没有验证。</w:t>
       </w:r>
       <w:hyperlink r:id="rId29">
         <w:r>
@@ -1495,7 +2380,7 @@
         <w:rPr>
           <w:rFonts/>
         </w:rPr>
-        <w:t>，§3</w:t>
+        <w:t>，§3、AppI</w:t>
       </w:r>
     </w:p>
     <w:p>
@@ -1503,7 +2388,59 @@
         <w:rPr>
           <w:rFonts/>
         </w:rPr>
-        <w:t>ScienceWorld、BabyAI和Crafter实验以200条学习episode、定期留出评估和三次seed考察持续学习；BabyAI曲线显示成功率约从67%接近100%，单轨迹美元成本约为ReAct的八分之一。这里是近似曲线结果、限该环境，不能外推网页或说墙钟时间也快八倍。尤其需要承认：附录已将技能学习费用按batch摊入，并统计输入、缓存输入和输出，不存在“该文完全忽略学习成本”的空白。</w:t>
+        <w:t>其</w:t>
+      </w:r>
+      <w:r>
+        <w:rPr>
+          <w:rFonts/>
+          <w:b/>
+        </w:rPr>
+        <w:t>原定义</w:t>
+      </w:r>
+      <w:r>
+        <w:rPr>
+          <w:rFonts/>
+        </w:rPr>
+        <w:t>用</w:t>
+      </w:r>
+      <w:r>
+        <w:rPr>
+          <w:rFonts w:ascii="Consolas" w:hAnsi="Consolas"/>
+          <w:sz w:val="21"/>
+        </w:rPr>
+        <w:t>g: L×H→L</w:t>
+      </w:r>
+      <w:r>
+        <w:rPr>
+          <w:rFonts/>
+        </w:rPr>
+        <w:t>表示技能归纳器：L为技能库，H为带库版本的历史轨迹。Algorithm1是执行一批任务、把轨迹和当时版本加入H、再令</w:t>
+      </w:r>
+      <w:r>
+        <w:rPr>
+          <w:rFonts w:ascii="Consolas" w:hAnsi="Consolas"/>
+          <w:sz w:val="21"/>
+        </w:rPr>
+        <w:t>L←g(L,H)</w:t>
+      </w:r>
+      <w:r>
+        <w:rPr>
+          <w:rFonts/>
+        </w:rPr>
+        <w:t>，两类模型权重均固定。它不是只将成功动作拼成宏。论文AppI.2的实际案例中，反复出现资源</w:t>
+      </w:r>
+      <w:r>
+        <w:rPr>
+          <w:rFonts w:ascii="Consolas" w:hAnsi="Consolas"/>
+          <w:sz w:val="21"/>
+        </w:rPr>
+        <w:t>not_found</w:t>
+      </w:r>
+      <w:r>
+        <w:rPr>
+          <w:rFonts/>
+        </w:rPr>
+        <w:t>错误，归纳器判断目标不在可见范围，加入有界局部探索，边移动边读观察，发现目标即停止。这把环境条件与恢复逻辑写进了程序，也直接涉及(b)。作者自述尚未覆盖旗舰模型和更昂贵的大型基准，在线收益有较大误差条与不稳定，未研究归纳器本身的元学习。</w:t>
       </w:r>
       <w:hyperlink r:id="rId29">
         <w:r>
@@ -1518,6 +2455,29 @@
         <w:rPr>
           <w:rFonts/>
         </w:rPr>
+        <w:t>，§§2–3、Limitations、AppI.2</w:t>
+      </w:r>
+    </w:p>
+    <w:p>
+      <w:r>
+        <w:rPr>
+          <w:rFonts/>
+        </w:rPr>
+        <w:t>ScienceWorld、BabyAI和Crafter实验以200条学习episode、定期留出评估和三次seed考察持续学习；BabyAI曲线显示成功率约从67%接近100%，单轨迹美元成本约为ReAct的八分之一。这里是近似曲线结果、限该环境，不能外推网页或说墙钟时间也快八倍。尤其需要承认：附录已将技能学习费用按batch摊入，并统计输入、缓存输入和输出，不存在“该文完全忽略学习成本”的空白。</w:t>
+      </w:r>
+      <w:hyperlink r:id="rId29">
+        <w:r>
+          <w:rPr>
+            <w:rFonts w:ascii="Arial" w:hAnsi="Arial" w:eastAsia="Songti SC"/>
+            <w:color w:val="185A8D"/>
+          </w:rPr>
+          <w:t>[23]</w:t>
+        </w:r>
+      </w:hyperlink>
+      <w:r>
+        <w:rPr>
+          <w:rFonts/>
+        </w:rPr>
         <w:t>，Fig3、AppA.3</w:t>
       </w:r>
     </w:p>
@@ -1636,6 +2596,46 @@
         <w:rPr>
           <w:rFonts/>
         </w:rPr>
+        <w:t>学到环境规则与建好反馈机制是两件事</w:t>
+      </w:r>
+    </w:p>
+    <w:p>
+      <w:r>
+        <w:rPr>
+          <w:rFonts/>
+        </w:rPr>
+        <w:t>“环境规则”可能是字段依赖、可用操作与前置条件、状态转移、搜索参数语义，或动作后哪些属性保持不变。它可以存在文字、schema、状态图、代码guard或预测器上下文里，不要求方法名叫world model。</w:t>
+      </w:r>
+      <w:r>
+        <w:rPr>
+          <w:rFonts/>
+          <w:b/>
+        </w:rPr>
+        <w:t>反馈机制</w:t>
+      </w:r>
+      <w:r>
+        <w:rPr>
+          <w:rFonts/>
+        </w:rPr>
+        <w:t>则回答如何知道刚才做对了：工具错误、页面真实变化、数据库状态差分、业务断言和最终任务评价提供的证据不同。学习器可以改对环境的认识，却不应随意改掉最终正确性标准。</w:t>
+      </w:r>
+    </w:p>
+    <w:p>
+      <w:r>
+        <w:rPr>
+          <w:rFonts/>
+        </w:rPr>
+        <w:t>一个有意义的(b)闭环至少要说清：观测到了什么，形成了哪条假设，假设如何改变预测或动作，用什么真实反馈检验，遇到矛盾怎样更新。只保存成功代码，不足以证明学到可修正的规则；但已有代码里的状态检查与恢复也不能被排除在环境学习之外。Metis、SpeedRunner、WALT、MobileGPT和ActionEngine都以不同形式覆盖了这个闭环的若干环节。</w:t>
+      </w:r>
+    </w:p>
+    <w:p>
+      <w:pPr>
+        <w:pStyle w:val="Heading2"/>
+      </w:pPr>
+      <w:r>
+        <w:rPr>
+          <w:rFonts/>
+        </w:rPr>
         <w:t>从自主探索到程序化复用</w:t>
       </w:r>
     </w:p>
@@ -1736,6 +2736,55 @@
         <w:rPr>
           <w:rFonts/>
         </w:rPr>
+        <w:t>WALT确实给出</w:t>
+      </w:r>
+      <w:r>
+        <w:rPr>
+          <w:rFonts/>
+          <w:b/>
+        </w:rPr>
+        <w:t>工具级原目标</w:t>
+      </w:r>
+      <w:r>
+        <w:rPr>
+          <w:rFonts/>
+        </w:rPr>
+        <w:t>：</w:t>
+      </w:r>
+      <w:r>
+        <w:rPr>
+          <w:rFonts w:ascii="Consolas" w:hAnsi="Consolas"/>
+          <w:sz w:val="21"/>
+        </w:rPr>
+        <w:t>min [FailRate(u,I_test) + StepCount(u) + AgenticRatio(u)]</w:t>
+      </w:r>
+      <w:r>
+        <w:rPr>
+          <w:rFonts/>
+        </w:rPr>
+        <w:t>。u为工具，I_test为测试输入；三项分别为测试失败率、primitive动作数、需要LLM推理的步骤比例。原文直接相加而未给统一单位的归一化权重，实现为演示、生成、优化、测试的循环，不能称为美元成本的精确最优解。§3.4的实例先实际搜索并观察URL，再归纳查询/分类参数，生成带类型的schema，用多组输入执行，失败时修正参数、定位和实现。作者在结论将长期在线tool patching列为未来方向；运行时fallback并不等于已经验证了持续工具库修复。</w:t>
+      </w:r>
+      <w:hyperlink r:id="rId35">
+        <w:r>
+          <w:rPr>
+            <w:rFonts w:ascii="Arial" w:hAnsi="Arial" w:eastAsia="Songti SC"/>
+            <w:color w:val="185A8D"/>
+          </w:rPr>
+          <w:t>[21]</w:t>
+        </w:r>
+      </w:hyperlink>
+      <w:r>
+        <w:rPr>
+          <w:rFonts/>
+        </w:rPr>
+        <w:t>，§§3.3–3.4、结论</w:t>
+      </w:r>
+    </w:p>
+    <w:p>
+      <w:r>
+        <w:rPr>
+          <w:rFonts/>
+        </w:rPr>
         <w:t>MobileGPT也是直接先例：预探索应用并建立页面、子任务和动作记忆，后续可匹配动作直接复用，失配时调用模型适配；高层规划和参数填充仍可能调用模型。其八应用80任务消融中，warm-start相对Derive基线平均延迟减62.5%、API费用减68.8%；但冷启动略增成本，且该消融在冷启动失败后由人修复路径。它证明条件复用可能有大收益，不能被描述成完全自主学习后自然达到同样收益。</w:t>
       </w:r>
       <w:hyperlink r:id="rId36">
@@ -1759,6 +2808,68 @@
         <w:rPr>
           <w:rFonts/>
         </w:rPr>
+        <w:t>MobileGPT没有给统一的时间损失函数，问题通过</w:t>
+      </w:r>
+      <w:r>
+        <w:rPr>
+          <w:rFonts/>
+          <w:b/>
+        </w:rPr>
+        <w:t>图结构和适配协议</w:t>
+      </w:r>
+      <w:r>
+        <w:rPr>
+          <w:rFonts/>
+        </w:rPr>
+        <w:t>定义：节点对应页面可提供的子任务，边对应动作序列，执行前检查关键UI属性。原文§5.1把</w:t>
+      </w:r>
+      <w:r>
+        <w:rPr>
+          <w:rFonts w:ascii="Consolas" w:hAnsi="Consolas"/>
+          <w:sz w:val="21"/>
+        </w:rPr>
+        <w:t>click(index=5)</w:t>
+      </w:r>
+      <w:r>
+        <w:rPr>
+          <w:rFonts/>
+        </w:rPr>
+        <w:t>先转为按元素属性找联系人Bob，再参数化为</w:t>
+      </w:r>
+      <w:r>
+        <w:rPr>
+          <w:rFonts w:ascii="Consolas" w:hAnsi="Consolas"/>
+          <w:sz w:val="21"/>
+        </w:rPr>
+        <w:t>contact_name</w:t>
+      </w:r>
+      <w:r>
+        <w:rPr>
+          <w:rFonts/>
+        </w:rPr>
+        <w:t>；新任务绑定Alice时，重新定位当前页面元素，不沿用旧索引。匹配失败进入LLM适配，历史示例可以包含人的纠正。作者自述图像型、缺乏文本表示的界面和跨应用任务仍有限制。</w:t>
+      </w:r>
+      <w:hyperlink r:id="rId36">
+        <w:r>
+          <w:rPr>
+            <w:rFonts w:ascii="Arial" w:hAnsi="Arial" w:eastAsia="Songti SC"/>
+            <w:color w:val="185A8D"/>
+          </w:rPr>
+          <w:t>[18]</w:t>
+        </w:r>
+      </w:hyperlink>
+      <w:r>
+        <w:rPr>
+          <w:rFonts/>
+        </w:rPr>
+        <w:t>，§§4–5、9</w:t>
+      </w:r>
+    </w:p>
+    <w:p>
+      <w:r>
+        <w:rPr>
+          <w:rFonts/>
+        </w:rPr>
         <w:t>ActionEngine用离线crawler构建状态机记忆，在线据此生成并执行程序。最新v2在四个WebArena域655题、同Claude Opus4.6比较中，成功率82.7%到91.2%，平均延迟87到27秒，估算API费0.40到0.05美元每题，属于这里最直接的时间与费用证据。</w:t>
       </w:r>
       <w:hyperlink r:id="rId37">
@@ -1805,6 +2916,55 @@
         <w:rPr>
           <w:rFonts/>
         </w:rPr>
+        <w:t>ActionEngine的</w:t>
+      </w:r>
+      <w:r>
+        <w:rPr>
+          <w:rFonts/>
+          <w:b/>
+        </w:rPr>
+        <w:t>原结构</w:t>
+      </w:r>
+      <w:r>
+        <w:rPr>
+          <w:rFonts/>
+        </w:rPr>
+        <w:t>是</w:t>
+      </w:r>
+      <w:r>
+        <w:rPr>
+          <w:rFonts w:ascii="Consolas" w:hAnsi="Consolas"/>
+          <w:sz w:val="21"/>
+        </w:rPr>
+        <w:t>M=(S,O,T)</w:t>
+      </w:r>
+      <w:r>
+        <w:rPr>
+          <w:rFonts/>
+        </w:rPr>
+        <w:t>：S为稳定页面模板，O为带参数、来源/目标页面、实现和输出schema的操作，T为转移关系。它保存获取实时数据的方法，不是把历史数据当答案。探索还探查搜索的exact/fuzzy/prefix语义与分页行为；编译器插入连接前后操作的导航路径。Patcher可区分本题程序错误和需要持久修改的通用环境知识，但主实验没有开启它。作者的失败分析给出关键词与实际标题不匹配的例子：提前生成整段程序减少模型决策，也可能失去“先看搜索结果再改查询”的适应机会。</w:t>
+      </w:r>
+      <w:hyperlink r:id="rId37">
+        <w:r>
+          <w:rPr>
+            <w:rFonts w:ascii="Arial" w:hAnsi="Arial" w:eastAsia="Songti SC"/>
+            <w:color w:val="185A8D"/>
+          </w:rPr>
+          <w:t>[22]</w:t>
+        </w:r>
+      </w:hyperlink>
+      <w:r>
+        <w:rPr>
+          <w:rFonts/>
+        </w:rPr>
+        <w:t>，§§3–4、AppA.2及失败分析</w:t>
+      </w:r>
+    </w:p>
+    <w:p>
+      <w:r>
+        <w:rPr>
+          <w:rFonts/>
+        </w:rPr>
         <w:t>探索并不一定要立即产代码。DRAFT先实际调用陌生工具，把参数和返回规律写入更准确的文档，再供固定Agent使用；它主要改善正确工具使用，没有证明净时间收益。这个轻量对照可以帮助我们判断，程序化执行究竟比正确的环境说明多带来多少价值。</w:t>
       </w:r>
       <w:hyperlink r:id="rId38">
@@ -1877,7 +3037,7 @@
         <w:rPr>
           <w:rFonts/>
         </w:rPr>
-        <w:t>GLoW 与 WorldEvolver 学的是环境规律</w:t>
+        <w:t>探索策略知识与环境预测模型是不同路线</w:t>
       </w:r>
     </w:p>
     <w:p>
@@ -1908,7 +3068,46 @@
         <w:rPr>
           <w:rFonts/>
         </w:rPr>
-        <w:t>Jericho实验中同类LLM基线都有1,000次环境交互预算；GPT-4.1-mini在Zork1预算内最高游戏分数的三次运行均值，GLoW为73.0、ICRL为51.7。但所谓100–800倍效率指相对部分RL方法的环境样本预算差，不是省这么多API费或时间。附录给LLM方法每1,000步约4–6美元，费用差较小；环境还允许返回状态并提供有效动作接口。企业网页是否有同样可重置、可枚举的接口，需要重新验证。</w:t>
+        <w:t>其</w:t>
+      </w:r>
+      <w:r>
+        <w:rPr>
+          <w:rFonts/>
+          <w:b/>
+        </w:rPr>
+        <w:t>原式(1)–(3)</w:t>
+      </w:r>
+      <w:r>
+        <w:rPr>
+          <w:rFonts/>
+        </w:rPr>
+        <w:t>用</w:t>
+      </w:r>
+      <w:r>
+        <w:rPr>
+          <w:rFonts w:ascii="Consolas" w:hAnsi="Consolas"/>
+          <w:sz w:val="21"/>
+        </w:rPr>
+        <w:t>v(τ)=max_t Σ_(j≤t) r_j</w:t>
+      </w:r>
+      <w:r>
+        <w:rPr>
+          <w:rFonts/>
+        </w:rPr>
+        <w:t>衡量轨迹的最大前缀累计奖励，保留top-k轨迹档案；全局LLM据此生成状态的已达价值与未来潜力，局部反思生成哪些动作有利的文字建议。τ为轨迹，r_j为第j步环境奖励。作者借</w:t>
+      </w:r>
+      <w:r>
+        <w:rPr>
+          <w:rFonts w:ascii="Consolas" w:hAnsi="Consolas"/>
+          <w:sz w:val="21"/>
+        </w:rPr>
+        <w:t>A(s,a)=Q(s,a)−V(s)</w:t>
+      </w:r>
+      <w:r>
+        <w:rPr>
+          <w:rFonts/>
+        </w:rPr>
+        <w:t>解释同起点多路径比较的直觉，但实际输出是文本动作优势，不是用数值优势训练策略。它没有显式下一观察预测器，潜力也不是实算的UCB统计置信上界。</w:t>
       </w:r>
       <w:hyperlink r:id="rId41">
         <w:r>
@@ -1923,7 +3122,7 @@
         <w:rPr>
           <w:rFonts/>
         </w:rPr>
-        <w:t>，Table1、AppC.1</w:t>
+        <w:t>，§§3.1–3.2</w:t>
       </w:r>
     </w:p>
     <w:p>
@@ -1931,7 +3130,43 @@
         <w:rPr>
           <w:rFonts/>
         </w:rPr>
-        <w:t>WorldEvolver更接近“记住环境怎样响应操作”：记录真实的观察—动作—新观察，用预测与实测的不一致生成带证据分的文字规则，并过滤低置信预测，actor与world model权重均固定。这说明环境模型也可以是检索和文字规则，不必训练一个神经网络。</w:t>
+        <w:t>Jericho实验中同类LLM基线都有1,000次环境交互预算；GPT-4.1-mini在Zork1预算内最高游戏分数的三次运行均值，GLoW为73.0、ICRL为51.7。但所谓100–800倍效率指相对部分RL方法的环境样本预算差，不是省这么多API费或时间。附录给LLM方法每1,000步约4–6美元，费用差较小；环境还允许返回状态并提供有效动作接口。企业网页是否有同样可重置、可枚举的接口，需要重新验证。</w:t>
+      </w:r>
+      <w:hyperlink r:id="rId41">
+        <w:r>
+          <w:rPr>
+            <w:rFonts w:ascii="Arial" w:hAnsi="Arial" w:eastAsia="Songti SC"/>
+            <w:color w:val="185A8D"/>
+          </w:rPr>
+          <w:t>[10]</w:t>
+        </w:r>
+      </w:hyperlink>
+      <w:r>
+        <w:rPr>
+          <w:rFonts/>
+        </w:rPr>
+        <w:t>，Table1、AppC.1</w:t>
+      </w:r>
+    </w:p>
+    <w:p>
+      <w:r>
+        <w:rPr>
+          <w:rFonts/>
+        </w:rPr>
+        <w:t>WorldEvolver更接近“预测环境怎样响应操作”：episodic记忆记录真实的观察—动作—新观察，按动作相似度检索；semantic记忆利用预测与实测差异形成带证据分的规则，actor与world model权重均固定。需要注意具体实现：正文泛称textual heuristics，但附录Fig25的该实现的规则提取器只抽取</w:t>
+      </w:r>
+      <w:r>
+        <w:rPr>
+          <w:rFonts/>
+          <w:b/>
+        </w:rPr>
+        <w:t>preservation rules，即执行动作时哪些事实不应改变</w:t>
+      </w:r>
+      <w:r>
+        <w:rPr>
+          <w:rFonts/>
+        </w:rPr>
+        <w:t>。Fig23另让真实转移示例提供“什么会变化”的类比。因此整体仍预测动作后果，不能反过来说它完全不学变化；也不能将语义分支夸大成已学齐一般因果规律和所有操作前置条件。</w:t>
       </w:r>
       <w:hyperlink r:id="rId42">
         <w:r>
@@ -1946,7 +3181,7 @@
         <w:rPr>
           <w:rFonts/>
         </w:rPr>
-        <w:t>，§3</w:t>
+        <w:t>，§3.2、AppE Figs22–25</w:t>
       </w:r>
     </w:p>
     <w:p>
@@ -1954,7 +3189,59 @@
         <w:rPr>
           <w:rFonts/>
         </w:rPr>
-        <w:t>其收益并非全面。Table2中Gemma配ReAct在ScienceWorld由44.44%到52.22%，GPT-5.4-mini同列却由65.56%降到63.33%；而且这是每题五次尝试的best-of-5。算法还增加预测、重新决策，动作变化时可能再预测一次。它支持“环境知识能改善部分决策”，尚不支持“加一个world model就能加速”。另一个消融在每题前清空记忆、只保留该题多次尝试间记忆，表现仅下降0.5–1.1个百分点；不能把总收益全部归因于跨任务积累。附录也报告逐步调用和上下文开销，但没有给净执行加速。作者明确限定在两个文本环境，并指出置信估计依赖模型API提供概率信息。</w:t>
+        <w:t>其</w:t>
+      </w:r>
+      <w:r>
+        <w:rPr>
+          <w:rFonts/>
+          <w:b/>
+        </w:rPr>
+        <w:t>原定义</w:t>
+      </w:r>
+      <w:r>
+        <w:rPr>
+          <w:rFonts/>
+        </w:rPr>
+        <w:t>是</w:t>
+      </w:r>
+      <w:r>
+        <w:rPr>
+          <w:rFonts w:ascii="Consolas" w:hAnsi="Consolas"/>
+          <w:sz w:val="21"/>
+        </w:rPr>
+        <w:t>M_E←M_E∪{(o_t,a_t,o_(t+1))}</w:t>
+      </w:r>
+      <w:r>
+        <w:rPr>
+          <w:rFonts/>
+        </w:rPr>
+        <w:t>，其中o为观察、a为动作；语义条目为</w:t>
+      </w:r>
+      <w:r>
+        <w:rPr>
+          <w:rFonts w:ascii="Consolas" w:hAnsi="Consolas"/>
+          <w:sz w:val="21"/>
+        </w:rPr>
+        <w:t>(rule,evidence)</w:t>
+      </w:r>
+      <w:r>
+        <w:rPr>
+          <w:rFonts/>
+        </w:rPr>
+        <w:t>，支持或矛盾会增减证据分，只有正分规则进入上下文。预测置信q是生成token概率的几何平均，低于阈值就不交给actor；q不是经保证的真实正确概率。算法先预测草案动作，actor据此重决策，若动作变化则重新预测实际动作再与实测比较。一个</w:t>
+      </w:r>
+      <w:r>
+        <w:rPr>
+          <w:rFonts/>
+          <w:b/>
+        </w:rPr>
+        <w:t>本文说明例</w:t>
+      </w:r>
+      <w:r>
+        <w:rPr>
+          <w:rFonts/>
+        </w:rPr>
+        <w:t>是：检查杯子时预测它移动了，而实测未动，抽取“examine不改变位置”约束，后续继续按证据修正。这是提示中的预测约束，不是硬动作屏蔽或形式证明。</w:t>
       </w:r>
       <w:hyperlink r:id="rId42">
         <w:r>
@@ -1969,6 +3256,29 @@
         <w:rPr>
           <w:rFonts/>
         </w:rPr>
+        <w:t>，§3、Algorithm1、AppE</w:t>
+      </w:r>
+    </w:p>
+    <w:p>
+      <w:r>
+        <w:rPr>
+          <w:rFonts/>
+        </w:rPr>
+        <w:t>其收益并非全面。Table2中Gemma配ReAct在ScienceWorld由44.44%到52.22%，GPT-5.4-mini同列却由65.56%降到63.33%；而且这是每题五次尝试的best-of-5。算法还增加预测、重新决策，动作变化时可能再预测一次。它支持“环境知识能改善部分决策”，尚不支持“加一个world model就能加速”。另一个消融在每题前清空记忆、只保留该题多次尝试间记忆，表现仅下降0.5–1.1个百分点；不能把总收益全部归因于跨任务积累。附录也报告逐步调用和上下文开销，但没有给净执行加速。作者明确限定在两个文本环境，并指出置信估计依赖模型API提供概率信息。</w:t>
+      </w:r>
+      <w:hyperlink r:id="rId42">
+        <w:r>
+          <w:rPr>
+            <w:rFonts w:ascii="Arial" w:hAnsi="Arial" w:eastAsia="Songti SC"/>
+            <w:color w:val="185A8D"/>
+          </w:rPr>
+          <w:t>[11]</w:t>
+        </w:r>
+      </w:hyperlink>
+      <w:r>
+        <w:rPr>
+          <w:rFonts/>
+        </w:rPr>
         <w:t>，§4.1、Table2、Limitations</w:t>
       </w:r>
     </w:p>
@@ -2076,6 +3386,83 @@
       </w:r>
     </w:p>
     <w:p>
+      <w:r>
+        <w:rPr>
+          <w:rFonts/>
+        </w:rPr>
+        <w:t>从</w:t>
+      </w:r>
+      <w:r>
+        <w:rPr>
+          <w:rFonts/>
+          <w:b/>
+        </w:rPr>
+        <w:t>问题定义</w:t>
+      </w:r>
+      <w:r>
+        <w:rPr>
+          <w:rFonts/>
+        </w:rPr>
+        <w:t>看，HarnessFix是有范围限制的补丁生成与验收：候选先符合修复规范和静态检查，再在验证任务上确认目标问题改善、回归不超限；它不是依靠对harness求导来更新。</w:t>
+      </w:r>
+      <w:hyperlink r:id="rId45">
+        <w:r>
+          <w:rPr>
+            <w:rFonts w:ascii="Arial" w:hAnsi="Arial" w:eastAsia="Songti SC"/>
+            <w:color w:val="185A8D"/>
+          </w:rPr>
+          <w:t>[29]</w:t>
+        </w:r>
+      </w:hyperlink>
+      <w:r>
+        <w:rPr>
+          <w:rFonts/>
+        </w:rPr>
+        <w:t>，§III-D。StarHarness原文式(1)写为</w:t>
+      </w:r>
+      <w:r>
+        <w:rPr>
+          <w:rFonts w:ascii="Consolas" w:hAnsi="Consolas"/>
+          <w:sz w:val="21"/>
+        </w:rPr>
+        <w:t>h* = argmax_{h∈H} J(h; D_holdout)</w:t>
+      </w:r>
+      <w:r>
+        <w:rPr>
+          <w:rFonts/>
+        </w:rPr>
+        <w:t>，h是harness、H是允许修改的空间，模型M固定，J是任务平均得分。作者虽把J称作cost function，紧接着明确其值越高越好，</w:t>
+      </w:r>
+      <w:r>
+        <w:rPr>
+          <w:rFonts/>
+          <w:b/>
+        </w:rPr>
+        <w:t>这里不是美元成本函数</w:t>
+      </w:r>
+      <w:r>
+        <w:rPr>
+          <w:rFonts/>
+        </w:rPr>
+        <w:t>。留出结果在搜索时不可见，实际通过search与selection集合近似选择，holdout只做最终评价。</w:t>
+      </w:r>
+      <w:hyperlink r:id="rId46">
+        <w:r>
+          <w:rPr>
+            <w:rFonts w:ascii="Arial" w:hAnsi="Arial" w:eastAsia="Songti SC"/>
+            <w:color w:val="185A8D"/>
+          </w:rPr>
+          <w:t>[30]</w:t>
+        </w:r>
+      </w:hyperlink>
+      <w:r>
+        <w:rPr>
+          <w:rFonts/>
+        </w:rPr>
+        <w:t>，§3.1</w:t>
+      </w:r>
+    </w:p>
+    <w:p>
       <w:pPr>
         <w:pStyle w:val="Heading2"/>
       </w:pPr>
@@ -2093,7 +3480,7 @@
         </w:rPr>
         <w:t>Adaptive Auto-Harness把学习与运行路由分开：从历史批次分析问题、调查、构建、验证，保留多个harness分支，再按任务选分支。FutureX中求解端每题耗时之和由34.2降到6.6小时，Pass@1从31.0%升至47.3%；同一论文PolyBench的时间却由25.6增到59.5小时。附录明确缺少evolver token和编排开销，这不是全流程墙钟时间或总费用。</w:t>
       </w:r>
-      <w:hyperlink r:id="rId45">
+      <w:hyperlink r:id="rId47">
         <w:r>
           <w:rPr>
             <w:rFonts w:ascii="Arial" w:hAnsi="Arial" w:eastAsia="Songti SC"/>
@@ -2116,7 +3503,7 @@
         </w:rPr>
         <w:t>Continual Harness让Actor与Refiner在不重置的长任务中修改提示、记忆、工具和代码。在Pokémon Emerald、Gemini3.1 Pro、每seed24小时设置下，from-scratch harness的中位API费用约130美元、里程碑完成100%，minimal约215美元、98%。这是有力的特定运行费用证据，但不是完成整个游戏时间减少40%；弱模型也可能无法利用复杂组件而退化。其基础接口还提供local text map等信息，不是只看裸截图。它的固定模型实验可以纳入本报告，后半涉及权重训练的分支则应分开。</w:t>
       </w:r>
-      <w:hyperlink r:id="rId46">
+      <w:hyperlink r:id="rId48">
         <w:r>
           <w:rPr>
             <w:rFonts w:ascii="Arial" w:hAnsi="Arial" w:eastAsia="Songti SC"/>
@@ -2139,7 +3526,7 @@
         </w:rPr>
         <w:t>Live-SWE-agent在当前软件任务中按需创建脚本，说明无需先做庞大的离线系统搜索，也能出现自改进。GPT-5的成功率和平均费从65.0%/0.28美元到68.4%/0.27美元；Gemini3 Pro从74.2%/0.46到77.4%/0.48，费用并不一致下降。这些基线数字沿用既有报告，未全部在统一条件下重新运行；微小费用差不能作为严格受控的因果证据。它主要验证当前任务内的工具创建，还不能直接证明跨任务积累长期省钱。</w:t>
       </w:r>
-      <w:hyperlink r:id="rId47">
+      <w:hyperlink r:id="rId49">
         <w:r>
           <w:rPr>
             <w:rFonts w:ascii="Arial" w:hAnsi="Arial" w:eastAsia="Songti SC"/>
@@ -2173,7 +3560,7 @@
         </w:rPr>
         <w:t>用户幻灯片中的HGM从DGM的版本树出发，区分一个Agent当前做题能力和它产生更好后代的潜力。它利用后代成绩估计分支潜力，自适应决定继续扩展还是增加评估。SWE-bench Verified的60题设置中，用GPT-5扩展、GPT-5-mini做任务评估，同为800次评估，allocated CPU-hours从DGM的1,231降到HGM的517，best-belief成功率从53.3%到56.7%。2.38倍来自前两个CPU小时数字，不能解释成最终Agent每题快2.38倍。</w:t>
       </w:r>
-      <w:hyperlink r:id="rId48">
+      <w:hyperlink r:id="rId50">
         <w:r>
           <w:rPr>
             <w:rFonts w:ascii="Arial" w:hAnsi="Arial" w:eastAsia="Songti SC"/>
@@ -2193,10 +3580,60 @@
       <w:r>
         <w:rPr>
           <w:rFonts/>
+          <w:b/>
+        </w:rPr>
+        <w:t>HGM原文§3.2–3.3</w:t>
+      </w:r>
+      <w:r>
+        <w:rPr>
+          <w:rFonts/>
+        </w:rPr>
+        <w:t>把clade metaproductivity定义为：给定当前版本树T、节点a、搜索策略π和剩余预算B，继续搜索后，在a的后代分支中由评分选出的最佳版本，其真实效用U的期望。这里的“潜力”取决于搜索策略和预算，不能只由当前节点的成功率定义。实现中的近似为</w:t>
+      </w:r>
+      <w:r>
+        <w:rPr>
+          <w:rFonts w:ascii="Consolas" w:hAnsi="Consolas"/>
+          <w:sz w:val="21"/>
+        </w:rPr>
+        <w:t>CMP_hat(a)=n_success(C(a)) / [n_success(C(a))+n_fail(C(a))]</w:t>
+      </w:r>
+      <w:r>
+        <w:rPr>
+          <w:rFonts/>
+        </w:rPr>
+        <w:t>；C(a)含a及其后代，计数汇总这整个分支的任务评测成功与失败，再用于Thompson sampling分配扩展机会。它不是对未来最大收益的直接无偏测量；论文关于理想机器的理论条件也不等于实际系统具有全局最优保证。这是</w:t>
+      </w:r>
+      <w:r>
+        <w:rPr>
+          <w:rFonts/>
+          <w:b/>
+        </w:rPr>
+        <w:t>改进搜索预算的分配机制</w:t>
+      </w:r>
+      <w:r>
+        <w:rPr>
+          <w:rFonts/>
+        </w:rPr>
+        <w:t>，并未把用户等待时间写入上述U的实际任务指标。</w:t>
+      </w:r>
+      <w:hyperlink r:id="rId50">
+        <w:r>
+          <w:rPr>
+            <w:rFonts w:ascii="Arial" w:hAnsi="Arial" w:eastAsia="Songti SC"/>
+            <w:color w:val="185A8D"/>
+          </w:rPr>
+          <w:t>[34]</w:t>
+        </w:r>
+      </w:hyperlink>
+    </w:p>
+    <w:p>
+      <w:r>
+        <w:rPr>
+          <w:rFonts/>
         </w:rPr>
         <w:t>DGM则证明固定基础模型、修改自身代码并保留候选archive可以提升能力；作者也承认更强版本推理更贵。完整搜索还可能很昂贵。因此我们不宜一开始复制庞大进化树；先用受限修改和清楚的成本目标验证收益，得到足够证据后再决定复杂搜索是否值得。</w:t>
       </w:r>
-      <w:hyperlink r:id="rId49">
+      <w:hyperlink r:id="rId51">
         <w:r>
           <w:rPr>
             <w:rFonts w:ascii="Arial" w:hAnsi="Arial" w:eastAsia="Songti SC"/>
@@ -2247,7 +3684,7 @@
           <w:t>[30]</w:t>
         </w:r>
       </w:hyperlink>
-      <w:hyperlink r:id="rId50">
+      <w:hyperlink r:id="rId52">
         <w:r>
           <w:rPr>
             <w:rFonts w:ascii="Arial" w:hAnsi="Arial" w:eastAsia="Songti SC"/>
@@ -2262,9 +3699,71 @@
         <w:rPr>
           <w:rFonts/>
         </w:rPr>
+        <w:t>AgentDevel的</w:t>
+      </w:r>
+      <w:r>
+        <w:rPr>
+          <w:rFonts/>
+          <w:b/>
+        </w:rPr>
+        <w:t>原文式(1)–(2)</w:t>
+      </w:r>
+      <w:r>
+        <w:rPr>
+          <w:rFonts/>
+        </w:rPr>
+        <w:t>定义</w:t>
+      </w:r>
+      <w:r>
+        <w:rPr>
+          <w:rFonts w:ascii="Consolas" w:hAnsi="Consolas"/>
+          <w:sz w:val="21"/>
+        </w:rPr>
+        <w:t>P2F={x∈D_train: p_old(x)=1 且 p_new(x)=0}</w:t>
+      </w:r>
+      <w:r>
+        <w:rPr>
+          <w:rFonts/>
+        </w:rPr>
+        <w:t>与</w:t>
+      </w:r>
+      <w:r>
+        <w:rPr>
+          <w:rFonts w:ascii="Consolas" w:hAnsi="Consolas"/>
+          <w:sz w:val="21"/>
+        </w:rPr>
+        <w:t>F2P={x∈D_train: p_old(x)=0 且 p_new(x)=1}</w:t>
+      </w:r>
+      <w:r>
+        <w:rPr>
+          <w:rFonts/>
+        </w:rPr>
+        <w:t>；p是单个用例是否通过的指示量。这将“修好了多少”和“弄坏了多少”分开，而不是只看平均分。原方法的版本接纳是在同一开发集D_train上做，不能把这层门禁称为独立的最终测试。我们借鉴的是逐用例回归证据，仍需另设未来任务的验收。</w:t>
+      </w:r>
+      <w:hyperlink r:id="rId53">
+        <w:r>
+          <w:rPr>
+            <w:rFonts w:ascii="Arial" w:hAnsi="Arial" w:eastAsia="Songti SC"/>
+            <w:color w:val="185A8D"/>
+          </w:rPr>
+          <w:t>[36]</w:t>
+        </w:r>
+      </w:hyperlink>
+      <w:r>
+        <w:rPr>
+          <w:rFonts/>
+        </w:rPr>
+        <w:t>，§§2.1、2.4</w:t>
+      </w:r>
+    </w:p>
+    <w:p>
+      <w:r>
+        <w:rPr>
+          <w:rFonts/>
+        </w:rPr>
         <w:t>VASO给出更具体的借鉴：把技能连接到形式规范，先检查规则是否自相矛盾，再验证生成计划，利用反例改善可复用契约。模型权重保持不变，全局规范固定。然而其命题映射由模型生成且没有被形式验证，保证依赖这个映射正确；当前只处理顺序执行技能。Table1中的97.2是手工映射的安全分，自动映射为96.8，不能说成自动系统97.2%的端到端任务正确率。</w:t>
       </w:r>
-      <w:hyperlink r:id="rId51">
+      <w:hyperlink r:id="rId54">
         <w:r>
           <w:rPr>
             <w:rFonts w:ascii="Arial" w:hAnsi="Arial" w:eastAsia="Songti SC"/>
@@ -2286,6 +3785,568 @@
           <w:rFonts/>
         </w:rPr>
         <w:t>我们的C方向可借鉴“把规范、观察映射和评分程序分开”，但不必强行把全部网页业务写成形式逻辑。第一轮可以从可执行的业务断言、环境真实状态检查和人工确认的小型评估集做起。关键是保留独立的最终标准；模型生成用例只是起点，人类和程序仍需核其覆盖与正确性。</w:t>
+      </w:r>
+    </w:p>
+    <w:p>
+      <w:r>
+        <w:rPr>
+          <w:rFonts/>
+        </w:rPr>
+        <w:t>VASO的</w:t>
+      </w:r>
+      <w:r>
+        <w:rPr>
+          <w:rFonts/>
+          <w:b/>
+        </w:rPr>
+        <w:t>原文定义</w:t>
+      </w:r>
+      <w:r>
+        <w:rPr>
+          <w:rFonts/>
+        </w:rPr>
+        <w:t>可进一步说明这个边界。技能含全局规范G、局部目标ψ和可复用契约C；C包括把轨迹观察映射为原子命题的函数L以及文字计划模板。逻辑可行性检查问</w:t>
+      </w:r>
+      <w:r>
+        <w:rPr>
+          <w:rFonts w:ascii="Consolas" w:hAnsi="Consolas"/>
+          <w:sz w:val="21"/>
+        </w:rPr>
+        <w:t>是否存在轨迹σ，使 L(σ) 满足 G ∧ ψ</w:t>
+      </w:r>
+      <w:r>
+        <w:rPr>
+          <w:rFonts/>
+        </w:rPr>
+        <w:t>；一般计划验证问</w:t>
+      </w:r>
+      <w:r>
+        <w:rPr>
+          <w:rFonts w:ascii="Consolas" w:hAnsi="Consolas"/>
+          <w:sz w:val="21"/>
+        </w:rPr>
+        <w:t>A_plan ⊗ M 是否满足 G ∧ ψ</w:t>
+      </w:r>
+      <w:r>
+        <w:rPr>
+          <w:rFonts/>
+        </w:rPr>
+        <w:t>。A_plan是计划转成的状态系统，M是</w:t>
+      </w:r>
+      <w:r>
+        <w:rPr>
+          <w:rFonts/>
+          <w:b/>
+        </w:rPr>
+        <w:t>预先给定</w:t>
+      </w:r>
+      <w:r>
+        <w:rPr>
+          <w:rFonts/>
+        </w:rPr>
+        <w:t>的环境动态模型，⊗表示组合，∧表示同时满足。作者的具体实现还使用直接检查计划状态系统的形式。因此它不是通过试错自动发现了所有环境规律：规范、环境模型、观察到命题的映射，各自可能是不同的误差来源。验证失败返回的反例可以指导改契约，但正确性保证仍以这些建模前提成立为条件。</w:t>
+      </w:r>
+      <w:hyperlink r:id="rId54">
+        <w:r>
+          <w:rPr>
+            <w:rFonts w:ascii="Arial" w:hAnsi="Arial" w:eastAsia="Songti SC"/>
+            <w:color w:val="185A8D"/>
+          </w:rPr>
+          <w:t>[9]</w:t>
+        </w:r>
+      </w:hyperlink>
+      <w:r>
+        <w:rPr>
+          <w:rFonts/>
+        </w:rPr>
+        <w:t>，§§3–4</w:t>
+      </w:r>
+    </w:p>
+    <w:p>
+      <w:pPr>
+        <w:pStyle w:val="Heading2"/>
+      </w:pPr>
+      <w:r>
+        <w:rPr>
+          <w:rFonts/>
+        </w:rPr>
+        <w:t>造数据可以服务于免训练改进</w:t>
+      </w:r>
+    </w:p>
+    <w:p>
+      <w:r>
+        <w:rPr>
+          <w:rFonts/>
+        </w:rPr>
+        <w:t>数据生成是否属于本次范围，要看数据最后用来更新什么。生成示范后做SFT或RL更新模型权重，属于综述的基础模型分支，本报告不把它作为可直接采用的方法；生成任务、测试、反例后只修改提示、记忆或代码，则仍在范围内。后一类至少有三个具体用途。</w:t>
+      </w:r>
+    </w:p>
+    <w:p>
+      <w:r>
+        <w:rPr>
+          <w:rFonts/>
+        </w:rPr>
+        <w:t>第一是</w:t>
+      </w:r>
+      <w:r>
+        <w:rPr>
+          <w:rFonts/>
+          <w:b/>
+        </w:rPr>
+        <w:t>生成探索任务和测试输入</w:t>
+      </w:r>
+      <w:r>
+        <w:rPr>
+          <w:rFonts/>
+        </w:rPr>
+        <w:t>。Voyager和SkillWeaver自主选择练习内容，SkillWeaver还给生成的API构造参数测试，再实际运行和修复。它产生的是技能学习和验收所需的交互数据，没有必要把这些数据训练进模型。</w:t>
+      </w:r>
+      <w:hyperlink r:id="rId34">
+        <w:r>
+          <w:rPr>
+            <w:rFonts w:ascii="Arial" w:hAnsi="Arial" w:eastAsia="Songti SC"/>
+            <w:color w:val="185A8D"/>
+          </w:rPr>
+          <w:t>[20]</w:t>
+        </w:r>
+      </w:hyperlink>
+      <w:r>
+        <w:rPr>
+          <w:rFonts/>
+        </w:rPr>
+        <w:t>，§§2.1–2.3；</w:t>
+      </w:r>
+      <w:hyperlink r:id="rId33">
+        <w:r>
+          <w:rPr>
+            <w:rFonts w:ascii="Arial" w:hAnsi="Arial" w:eastAsia="Songti SC"/>
+            <w:color w:val="185A8D"/>
+          </w:rPr>
+          <w:t>[26]</w:t>
+        </w:r>
+      </w:hyperlink>
+      <w:r>
+        <w:rPr>
+          <w:rFonts/>
+        </w:rPr>
+        <w:t>，§3。本文判断：自动出题可以降低任务编写成本，但练习分布可能偏向Agent已会完成的操作；生成参数也不保证覆盖权限、状态和边界条件。</w:t>
+      </w:r>
+    </w:p>
+    <w:p>
+      <w:r>
+        <w:rPr>
+          <w:rFonts/>
+        </w:rPr>
+        <w:t>第二是</w:t>
+      </w:r>
+      <w:r>
+        <w:rPr>
+          <w:rFonts/>
+          <w:b/>
+        </w:rPr>
+        <w:t>生成有外部依据的代理测试</w:t>
+      </w:r>
+      <w:r>
+        <w:rPr>
+          <w:rFonts/>
+        </w:rPr>
+        <w:t>。OpenSkill将任务指令I、环境E和外部知识K用于构造skill集合S；构造时看不到最终测试T_GT。其原文式(2)–(4)为</w:t>
+      </w:r>
+      <w:r>
+        <w:rPr>
+          <w:rFonts w:ascii="Consolas" w:hAnsi="Consolas"/>
+          <w:sz w:val="21"/>
+        </w:rPr>
+        <w:t>S = f(I,E,K)</w:t>
+      </w:r>
+      <w:r>
+        <w:rPr>
+          <w:rFonts/>
+        </w:rPr>
+        <w:t>、</w:t>
+      </w:r>
+      <w:r>
+        <w:rPr>
+          <w:rFonts w:ascii="Consolas" w:hAnsi="Consolas"/>
+          <w:sz w:val="21"/>
+        </w:rPr>
+        <w:t>T_proxy = g(I,E,K_verify)</w:t>
+      </w:r>
+      <w:r>
+        <w:rPr>
+          <w:rFonts/>
+        </w:rPr>
+        <w:t>，代理分数是各条代理断言对执行结果的平均通过率。K_verify是文档参考值、数据不变量、标准格式等验证依据；g用隔离的LLM会话生成可执行断言。最终固定S后才用T_GT评价。这清楚地区分了“用代理信号改进”和“最终成功”：</w:t>
+      </w:r>
+      <w:r>
+        <w:rPr>
+          <w:rFonts/>
+          <w:b/>
+        </w:rPr>
+        <w:t>作者明确承认</w:t>
+      </w:r>
+      <w:r>
+        <w:rPr>
+          <w:rFonts/>
+        </w:rPr>
+        <w:t>，代理测试与真实目标不一致时会奖励对代理的过拟合，并专门测量二者一致性。</w:t>
+      </w:r>
+      <w:hyperlink r:id="rId32">
+        <w:r>
+          <w:rPr>
+            <w:rFonts w:ascii="Arial" w:hAnsi="Arial" w:eastAsia="Songti SC"/>
+            <w:color w:val="185A8D"/>
+          </w:rPr>
+          <w:t>[25]</w:t>
+        </w:r>
+      </w:hyperlink>
+      <w:r>
+        <w:rPr>
+          <w:rFonts/>
+        </w:rPr>
+        <w:t>，§§2.1–2.2、4.2</w:t>
+      </w:r>
+    </w:p>
+    <w:p>
+      <w:r>
+        <w:rPr>
+          <w:rFonts/>
+        </w:rPr>
+        <w:t>第三是</w:t>
+      </w:r>
+      <w:r>
+        <w:rPr>
+          <w:rFonts/>
+          <w:b/>
+        </w:rPr>
+        <w:t>生成真实失败的反例与回归用例</w:t>
+      </w:r>
+      <w:r>
+        <w:rPr>
+          <w:rFonts/>
+        </w:rPr>
+        <w:t>。VASO的模型检查器在给定规范和模型下给出违例轨迹，AgentDevel保留pass→fail与fail→pass比较；这些证据比让同一个LLM凭空给自己的输出打分更容易追查，但前者仍依赖模型和映射，后者仍依赖原测试的覆盖。</w:t>
+      </w:r>
+      <w:hyperlink r:id="rId54">
+        <w:r>
+          <w:rPr>
+            <w:rFonts w:ascii="Arial" w:hAnsi="Arial" w:eastAsia="Songti SC"/>
+            <w:color w:val="185A8D"/>
+          </w:rPr>
+          <w:t>[9]</w:t>
+        </w:r>
+      </w:hyperlink>
+      <w:r>
+        <w:rPr>
+          <w:rFonts/>
+        </w:rPr>
+        <w:t>，§4；</w:t>
+      </w:r>
+      <w:hyperlink r:id="rId52">
+        <w:r>
+          <w:rPr>
+            <w:rFonts w:ascii="Arial" w:hAnsi="Arial" w:eastAsia="Songti SC"/>
+            <w:color w:val="185A8D"/>
+          </w:rPr>
+          <w:t>[36]</w:t>
+        </w:r>
+      </w:hyperlink>
+      <w:r>
+        <w:rPr>
+          <w:rFonts/>
+        </w:rPr>
+        <w:t>，§3</w:t>
+      </w:r>
+    </w:p>
+    <w:p>
+      <w:r>
+        <w:rPr>
+          <w:rFonts/>
+        </w:rPr>
+        <w:t>对我们的实际含义是：先让数据生成支持两条主线，例如给高频操作生成新的参数组合、为怀疑的环境规则设计区分性实验、把真实失败转成回归用例；不必另起一个“造更多训练数据”的项目。必须分别记录用例生成成本、用例有效率、错误接受技能的比例，以及最终留出任务的表现。</w:t>
+      </w:r>
+      <w:r>
+        <w:rPr>
+          <w:rFonts/>
+          <w:b/>
+        </w:rPr>
+        <w:t>生成器产出了很多测试，不等于反馈机制已经可靠；更高代理分数，也不等于业务正确性或净加速。</w:t>
+      </w:r>
+    </w:p>
+    <w:p>
+      <w:pPr>
+        <w:pStyle w:val="Heading2"/>
+      </w:pPr>
+      <w:r>
+        <w:rPr>
+          <w:rFonts/>
+        </w:rPr>
+        <w:t>哪些评测可以真正检验我们的假设</w:t>
+      </w:r>
+    </w:p>
+    <w:p>
+      <w:r>
+        <w:rPr>
+          <w:rFonts/>
+        </w:rPr>
+        <w:t>评测目录补筛后，最有用的不是再加一串benchmark名字，而是确定每个环境允许观察什么、什么状态能重置、何种反馈可供学习、最终怎样验收。综述描述的理想持续改进评测，并不意味着目录中每个基准都现成支持这种协议。</w:t>
+      </w:r>
+    </w:p>
+    <w:p>
+      <w:r>
+        <w:rPr>
+          <w:rFonts/>
+          <w:b/>
+        </w:rPr>
+        <w:t>第一轮主环境可从AppWorld、WorkArena、WebArena选一个。</w:t>
+      </w:r>
+      <w:r>
+        <w:rPr>
+          <w:rFonts/>
+        </w:rPr>
+        <w:t xml:space="preserve"> AppWorld提供跨应用API、可恢复的数据库与时间，用状态差分检查必要变化及不应发生的额外变化；它还用同一scenario的全部实例通过来衡量稳健性。它适合隔离流程知识、程序技能和条件变化，但不能替代网页视觉定位问题。</w:t>
+      </w:r>
+      <w:hyperlink r:id="rId55">
+        <w:r>
+          <w:rPr>
+            <w:rFonts w:ascii="Arial" w:hAnsi="Arial" w:eastAsia="Songti SC"/>
+            <w:color w:val="185A8D"/>
+          </w:rPr>
+          <w:t>[42]</w:t>
+        </w:r>
+      </w:hyperlink>
+      <w:r>
+        <w:rPr>
+          <w:rFonts/>
+        </w:rPr>
+        <w:t>，§§2–3、评价附录。WorkArena更贴近企业网页操作，有参数化任务与运行中validate接口；反馈可能实时可见，必须固定是否提供、每次调用成本和任务清理协议，不能笼统假设所有学习信号都是隐藏终局标签。</w:t>
+      </w:r>
+      <w:hyperlink r:id="rId56">
+        <w:r>
+          <w:rPr>
+            <w:rFonts w:ascii="Arial" w:hAnsi="Arial" w:eastAsia="Songti SC"/>
+            <w:color w:val="185A8D"/>
+          </w:rPr>
+          <w:t>[43]</w:t>
+        </w:r>
+      </w:hyperlink>
+      <w:r>
+        <w:rPr>
+          <w:rFonts/>
+        </w:rPr>
+        <w:t>，任务接口与评测设置。WebArena的自托管网站更易恢复状态，终局以功能是否满足来评价，但部分答案题使用LLM judge，也不是全题确定性评分。</w:t>
+      </w:r>
+      <w:hyperlink r:id="rId57">
+        <w:r>
+          <w:rPr>
+            <w:rFonts w:ascii="Arial" w:hAnsi="Arial" w:eastAsia="Songti SC"/>
+            <w:color w:val="185A8D"/>
+          </w:rPr>
+          <w:t>[44]</w:t>
+        </w:r>
+      </w:hyperlink>
+      <w:r>
+        <w:rPr>
+          <w:rFonts/>
+        </w:rPr>
+        <w:t>，§3、AppA.2</w:t>
+      </w:r>
+    </w:p>
+    <w:p>
+      <w:r>
+        <w:rPr>
+          <w:rFonts/>
+          <w:b/>
+        </w:rPr>
+        <w:t>规则遵守要另测。</w:t>
+      </w:r>
+      <w:r>
+        <w:rPr>
+          <w:rFonts/>
+        </w:rPr>
+        <w:t xml:space="preserve"> ST-WebAgentBench把任务完成与轨迹中的策略合规分开，适合检验生成的宏是否跳过必要步骤。它的环境reset接口不能直接当作底层业务数据库已经完整回滚的证明；传回info的内容也不自动等于actor看到了这些反馈，接入时需要实测。它提供的是规则验收协议，本身不证明Agent已经学会未知环境规律。</w:t>
+      </w:r>
+      <w:hyperlink r:id="rId58">
+        <w:r>
+          <w:rPr>
+            <w:rFonts w:ascii="Arial" w:hAnsi="Arial" w:eastAsia="Songti SC"/>
+            <w:color w:val="185A8D"/>
+          </w:rPr>
+          <w:t>[45]</w:t>
+        </w:r>
+      </w:hyperlink>
+      <w:r>
+        <w:rPr>
+          <w:rFonts/>
+        </w:rPr>
+        <w:t>，任务/评价协议及配套代码</w:t>
+      </w:r>
+    </w:p>
+    <w:p>
+      <w:r>
+        <w:rPr>
+          <w:rFonts/>
+          <w:b/>
+        </w:rPr>
+        <w:t>探索机制最好有单独的可控测试。</w:t>
+      </w:r>
+      <w:r>
+        <w:rPr>
+          <w:rFonts/>
+        </w:rPr>
+        <w:t xml:space="preserve"> DiscoveryWorld区分最终完成、有效实验操作与学到正确知识；默认基线不跨题保留知识，若研究经验积累，需要明确采用其seed/theme划分并添加持续记忆协议。</w:t>
+      </w:r>
+      <w:hyperlink r:id="rId59">
+        <w:r>
+          <w:rPr>
+            <w:rFonts w:ascii="Arial" w:hAnsi="Arial" w:eastAsia="Songti SC"/>
+            <w:color w:val="185A8D"/>
+          </w:rPr>
+          <w:t>[50]</w:t>
+        </w:r>
+      </w:hyperlink>
+      <w:r>
+        <w:rPr>
+          <w:rFonts/>
+        </w:rPr>
+        <w:t>，§§3–4。PhysGym通过控制物理规则先验，观察Agent怎样选择实验、提出规律，并提供明确的实验与oracle验证预算；可以减少靠已有常识猜中答案的混杂，但它测的是物理函数规律，不能替代有权限、不可逆操作和部分可见状态的企业流程。</w:t>
+      </w:r>
+      <w:hyperlink r:id="rId60">
+        <w:r>
+          <w:rPr>
+            <w:rFonts w:ascii="Arial" w:hAnsi="Arial" w:eastAsia="Songti SC"/>
+            <w:color w:val="185A8D"/>
+          </w:rPr>
+          <w:t>[51]</w:t>
+        </w:r>
+      </w:hyperlink>
+      <w:r>
+        <w:rPr>
+          <w:rFonts/>
+        </w:rPr>
+        <w:t>，§§3–4。DiscoveryWorld的知识评价、PhysGym的方程评价部分依赖LLM judge；PhysGym的oracle测试结果也会反馈给Agent，不能说成完全无答案反馈。这两类用于验证“怎样学”，主业务环境用于验证“学到后是否实际省资源”。</w:t>
+      </w:r>
+    </w:p>
+    <w:p>
+      <w:r>
+        <w:rPr>
+          <w:rFonts/>
+          <w:b/>
+        </w:rPr>
+        <w:t>静态轨迹和反馈预算曲线不等于在线持续改进。</w:t>
+      </w:r>
+      <w:r>
+        <w:rPr>
+          <w:rFonts/>
+        </w:rPr>
+        <w:t xml:space="preserve"> Mind2Web逐步提供正确历史，Task SR衡量参考路径上的动作是否全部匹配；WebLINX主要对多轮示范做动作与文本匹配，它们适合组件和经验提取研究，不能代替真实在线终局成功。</w:t>
+      </w:r>
+      <w:hyperlink r:id="rId61">
+        <w:r>
+          <w:rPr>
+            <w:rFonts w:ascii="Arial" w:hAnsi="Arial" w:eastAsia="Songti SC"/>
+            <w:color w:val="185A8D"/>
+          </w:rPr>
+          <w:t>[46]</w:t>
+        </w:r>
+      </w:hyperlink>
+      <w:r>
+        <w:rPr>
+          <w:rFonts/>
+        </w:rPr>
+        <w:t>，§4；</w:t>
+      </w:r>
+      <w:hyperlink r:id="rId62">
+        <w:r>
+          <w:rPr>
+            <w:rFonts w:ascii="Arial" w:hAnsi="Arial" w:eastAsia="Songti SC"/>
+            <w:color w:val="185A8D"/>
+          </w:rPr>
+          <w:t>[47]</w:t>
+        </w:r>
+      </w:hyperlink>
+      <w:r>
+        <w:rPr>
+          <w:rFonts/>
+        </w:rPr>
+        <w:t>，§7。MINT适合测工具和语言反馈的利用，但原协议对不同交互预算分别从头运行，不是保存前一预算下的经验继续学习，不能把其曲线直接称为跨任务进化收益。</w:t>
+      </w:r>
+      <w:hyperlink r:id="rId63">
+        <w:r>
+          <w:rPr>
+            <w:rFonts w:ascii="Arial" w:hAnsi="Arial" w:eastAsia="Songti SC"/>
+            <w:color w:val="185A8D"/>
+          </w:rPr>
+          <w:t>[52]</w:t>
+        </w:r>
+      </w:hyperlink>
+      <w:r>
+        <w:rPr>
+          <w:rFonts/>
+        </w:rPr>
+        <w:t>，§3</w:t>
+      </w:r>
+    </w:p>
+    <w:p>
+      <w:r>
+        <w:rPr>
+          <w:rFonts/>
+          <w:b/>
+        </w:rPr>
+        <w:t>后期再检验真实系统与费用口径。</w:t>
+      </w:r>
+      <w:r>
+        <w:rPr>
+          <w:rFonts/>
+        </w:rPr>
+        <w:t xml:space="preserve"> OSWorld提供真实电脑环境与可执行检查，VM恢复不自动回滚远端账户；ClawBench包含真实网站操作，重置浏览器或客户端也不等于恢复网站服务器状态。ClawBench还拦截终端提交，其成功评分表示到达规定的拦截或等价终点，不能当作服务器已经完成真实业务写入的证明。两者能检验外部有效性，但第一轮容易混入界面漂移、网络与环境运行噪声。</w:t>
+      </w:r>
+      <w:hyperlink r:id="rId64">
+        <w:r>
+          <w:rPr>
+            <w:rFonts w:ascii="Arial" w:hAnsi="Arial" w:eastAsia="Songti SC"/>
+            <w:color w:val="185A8D"/>
+          </w:rPr>
+          <w:t>[48]</w:t>
+        </w:r>
+      </w:hyperlink>
+      <w:hyperlink r:id="rId65">
+        <w:r>
+          <w:rPr>
+            <w:rFonts w:ascii="Arial" w:hAnsi="Arial" w:eastAsia="Songti SC"/>
+            <w:color w:val="185A8D"/>
+          </w:rPr>
+          <w:t>[49]</w:t>
+        </w:r>
+      </w:hyperlink>
+      <w:r>
+        <w:rPr>
+          <w:rFonts/>
+        </w:rPr>
+        <w:t>，各自环境与评价协议。AstaBench按固定价格快照、缓存费率和明确工具权限比较质量与费用，这些口径值得借鉴；标准化费用仍不是实际账单，也不包含我们全部探索、构造和维护成本，不能直接当生命周期回本。</w:t>
+      </w:r>
+      <w:hyperlink r:id="rId66">
+        <w:r>
+          <w:rPr>
+            <w:rFonts w:ascii="Arial" w:hAnsi="Arial" w:eastAsia="Songti SC"/>
+            <w:color w:val="185A8D"/>
+          </w:rPr>
+          <w:t>[53]</w:t>
+        </w:r>
+      </w:hyperlink>
+      <w:r>
+        <w:rPr>
+          <w:rFonts/>
+        </w:rPr>
+        <w:t>，§4</w:t>
+      </w:r>
+    </w:p>
+    <w:p>
+      <w:r>
+        <w:rPr>
+          <w:rFonts/>
+        </w:rPr>
+        <w:t>采用任何基准前，先做一次小规模协议检查：相同起始状态能否恢复；学习器究竟能看见哪些反馈；最终判分是否覆盖无关副作用；baseline与改进版的观察和权限是否一致。已有AppWorld等已经使用条件变化和副作用检查，所以“增加条件测试”本身也不是新贡献。我们要验证的是特定学习机制在这些约束下的净收益。</w:t>
       </w:r>
     </w:p>
     <w:p>
@@ -3388,6 +5449,59 @@
       </w:r>
     </w:p>
     <w:p>
+      <w:r>
+        <w:rPr>
+          <w:rFonts/>
+        </w:rPr>
+        <w:t>尤其H1不能只对比“完全没有条件检查”的稻草人：SkillWeaver的docstring已记录前置状态，MobileGPT已有适用性检查，SpeedRunner技能会加入guard与恢复。真正可比较的是条件来自什么证据、如何更新、检查覆盖与开销如何，以及它们在环境变化后是否仍划算。“带条件”这三个字本身不是区别。</w:t>
+      </w:r>
+      <w:hyperlink r:id="rId34">
+        <w:r>
+          <w:rPr>
+            <w:rFonts w:ascii="Arial" w:hAnsi="Arial" w:eastAsia="Songti SC"/>
+            <w:color w:val="185A8D"/>
+          </w:rPr>
+          <w:t>[20]</w:t>
+        </w:r>
+      </w:hyperlink>
+      <w:r>
+        <w:rPr>
+          <w:rFonts/>
+        </w:rPr>
+        <w:t>，§2.2；</w:t>
+      </w:r>
+      <w:hyperlink r:id="rId36">
+        <w:r>
+          <w:rPr>
+            <w:rFonts w:ascii="Arial" w:hAnsi="Arial" w:eastAsia="Songti SC"/>
+            <w:color w:val="185A8D"/>
+          </w:rPr>
+          <w:t>[18]</w:t>
+        </w:r>
+      </w:hyperlink>
+      <w:r>
+        <w:rPr>
+          <w:rFonts/>
+        </w:rPr>
+        <w:t>，§§4–5；</w:t>
+      </w:r>
+      <w:hyperlink r:id="rId29">
+        <w:r>
+          <w:rPr>
+            <w:rFonts w:ascii="Arial" w:hAnsi="Arial" w:eastAsia="Songti SC"/>
+            <w:color w:val="185A8D"/>
+          </w:rPr>
+          <w:t>[23]</w:t>
+        </w:r>
+      </w:hyperlink>
+      <w:r>
+        <w:rPr>
+          <w:rFonts/>
+        </w:rPr>
+        <w:t>，AppI</w:t>
+      </w:r>
+    </w:p>
+    <w:p>
       <w:pPr>
         <w:pStyle w:val="Heading2"/>
       </w:pPr>
@@ -3856,7 +5970,7 @@
         <w:rPr>
           <w:rFonts/>
         </w:rPr>
-        <w:t>为分别检验H1和H2，在同一技能库上先比较有无适用条件检查，再在相同检查机制下比较固定预算探索与收益导向探索，避免把全部新增组件的效果混在一起。</w:t>
+        <w:t>为分别检验H1和H2，保留基线已有guard和回退，在同一技能库上比较是否增加由新证据维护的显式条件检查；关闭新增检查只作为消融，并另与完整近邻方法比较。随后在相同检查机制下比较固定预算探索与收益导向探索，避免把全部新增组件的效果混在一起。</w:t>
       </w:r>
     </w:p>
     <w:p>
@@ -3875,7 +5989,7 @@
         <w:rPr>
           <w:rFonts/>
         </w:rPr>
-        <w:t>评价同时保留三份账</w:t>
+        <w:t>先验证已有方法 再检验差异化假设</w:t>
       </w:r>
     </w:p>
     <w:p>
@@ -3883,7 +5997,20 @@
         <w:rPr>
           <w:rFonts/>
         </w:rPr>
-        <w:t>构造账包括生成历史轨迹、额外探索、反思、写工具与依赖准备；选择账包括候选比较、回归测试和被拒绝修改；执行账包括检索、技能匹配、常规模型调用、环境开销和失败回退。维护成本另列，不计入构造账，以便统计环境变化的代价。历史轨迹如果是既有业务自然产生，可以另报“已有日志可用”的增量场景，但不能把它与从零生成日志的场景混在一起。</w:t>
+        <w:t>第一组实验应当被明确称为</w:t>
+      </w:r>
+      <w:r>
+        <w:rPr>
+          <w:rFonts/>
+          <w:b/>
+        </w:rPr>
+        <w:t>已有机制的复现或迁移验证</w:t>
+      </w:r>
+      <w:r>
+        <w:rPr>
+          <w:rFonts/>
+        </w:rPr>
+        <w:t>：轨迹文字记忆参考AWM/ReasoningBank，文字到代码参考Metis，直接程序技能参考SpeedRunner/ASI，环境先验参考DRAFT或MobileGPT/ActionEngine，受限harness修改参考HarnessFix/StarHarness。优先从能保持模型、权限、输入和预算一致的实现中选代表；不要求一次复现全部方法，也不应自行弱化baseline后沿用其论文名称。若只实现某一机制，应称“受某文启发的对照”。</w:t>
       </w:r>
     </w:p>
     <w:p>
@@ -3891,7 +6018,239 @@
         <w:rPr>
           <w:rFonts/>
         </w:rPr>
+        <w:t>第二组是</w:t>
+      </w:r>
+      <w:r>
+        <w:rPr>
+          <w:rFonts/>
+          <w:b/>
+        </w:rPr>
+        <w:t>目标场景下的证据补充</w:t>
+      </w:r>
+      <w:r>
+        <w:rPr>
+          <w:rFonts/>
+        </w:rPr>
+        <w:t>：任务重复度变化、参数与状态组合变化、规则更新后维护、冷启动到回本的累计账。这些实验可能已有相邻先例，价值在于验证目标业务条件下是否成立；不能因为别人的论文没有报告我们的某张表，就宣布发现了新机制。</w:t>
+      </w:r>
+    </w:p>
+    <w:p>
+      <w:r>
+        <w:rPr>
+          <w:rFonts/>
+        </w:rPr>
+        <w:t>第三组才是</w:t>
+      </w:r>
+      <w:r>
+        <w:rPr>
+          <w:rFonts/>
+          <w:b/>
+        </w:rPr>
+        <w:t>候选方法假设</w:t>
+      </w:r>
+      <w:r>
+        <w:rPr>
+          <w:rFonts/>
+        </w:rPr>
+        <w:t>：H1的显式条件检查、H2的收益导向探测，以及成本与失败频次共同引导的故障定位。接受为研究贡献之前，必须同时满足：与最接近方法的区别可明确实现；新增组件的消融有收益；收益能在留出或变化任务中保留；建设与验证代价没有吞掉节省。目前这些只是值得检验的问题，尚未建立新颖性。</w:t>
+      </w:r>
+    </w:p>
+    <w:p>
+      <w:pPr>
+        <w:pStyle w:val="Heading2"/>
+      </w:pPr>
+      <w:r>
+        <w:rPr>
+          <w:rFonts/>
+        </w:rPr>
+        <w:t>两条主线之外还值得试什么</w:t>
+      </w:r>
+    </w:p>
+    <w:p>
+      <w:r>
+        <w:rPr>
+          <w:rFonts/>
+          <w:b/>
+        </w:rPr>
+        <w:t>经验选择与删除</w:t>
+      </w:r>
+      <w:r>
+        <w:rPr>
+          <w:rFonts/>
+        </w:rPr>
+        <w:t>可以先于更复杂的技能生成。MemRL区分语义相似与奖励效用，SEDM已有成本敏感的接纳与删除；若大部分开销来自读入过多历史，可以固定已有经验集合，只比较检索、压缩和淘汰，检验有多少收益不需要再造工具。</w:t>
+      </w:r>
+      <w:hyperlink r:id="rId25">
+        <w:r>
+          <w:rPr>
+            <w:rFonts w:ascii="Arial" w:hAnsi="Arial" w:eastAsia="Songti SC"/>
+            <w:color w:val="185A8D"/>
+          </w:rPr>
+          <w:t>[16]</w:t>
+        </w:r>
+      </w:hyperlink>
+      <w:hyperlink r:id="rId26">
+        <w:r>
+          <w:rPr>
+            <w:rFonts w:ascii="Arial" w:hAnsi="Arial" w:eastAsia="Songti SC"/>
+            <w:color w:val="185A8D"/>
+          </w:rPr>
+          <w:t>[39]</w:t>
+        </w:r>
+      </w:hyperlink>
+    </w:p>
+    <w:p>
+      <w:r>
+        <w:rPr>
+          <w:rFonts/>
+          <w:b/>
+        </w:rPr>
+        <w:t>改进搜索与验证预算分配</w:t>
+      </w:r>
+      <w:r>
+        <w:rPr>
+          <w:rFonts/>
+        </w:rPr>
+        <w:t>适合另一种瓶颈：如果寻找好版本本身很贵，而上线后的收益已有证据，可比较GEPA式小批过滤、HGM式自适应评估，以及固定预算候选比较。其目标是降低研发/适配成本，必须单列结果，不与最终执行加速混用。</w:t>
+      </w:r>
+      <w:hyperlink r:id="rId17">
+        <w:r>
+          <w:rPr>
+            <w:rFonts w:ascii="Arial" w:hAnsi="Arial" w:eastAsia="Songti SC"/>
+            <w:color w:val="185A8D"/>
+          </w:rPr>
+          <w:t>[4]</w:t>
+        </w:r>
+      </w:hyperlink>
+      <w:hyperlink r:id="rId50">
+        <w:r>
+          <w:rPr>
+            <w:rFonts w:ascii="Arial" w:hAnsi="Arial" w:eastAsia="Songti SC"/>
+            <w:color w:val="185A8D"/>
+          </w:rPr>
+          <w:t>[34]</w:t>
+        </w:r>
+      </w:hyperlink>
+    </w:p>
+    <w:p>
+      <w:r>
+        <w:rPr>
+          <w:rFonts/>
+          <w:b/>
+        </w:rPr>
+        <w:t>工具说明与固定执行结构的修正</w:t>
+      </w:r>
+      <w:r>
+        <w:rPr>
+          <w:rFonts/>
+        </w:rPr>
+        <w:t>是更轻的起点。DRAFT通过交互澄清陌生工具语义，StarHarness修正接口和确定性计算；可能仅改善schema、缩短观察、直接调用已有API就足够，不一定需要长期记忆或自演化循环。</w:t>
+      </w:r>
+      <w:hyperlink r:id="rId38">
+        <w:r>
+          <w:rPr>
+            <w:rFonts w:ascii="Arial" w:hAnsi="Arial" w:eastAsia="Songti SC"/>
+            <w:color w:val="185A8D"/>
+          </w:rPr>
+          <w:t>[27]</w:t>
+        </w:r>
+      </w:hyperlink>
+      <w:hyperlink r:id="rId44">
+        <w:r>
+          <w:rPr>
+            <w:rFonts w:ascii="Arial" w:hAnsi="Arial" w:eastAsia="Songti SC"/>
+            <w:color w:val="185A8D"/>
+          </w:rPr>
+          <w:t>[30]</w:t>
+        </w:r>
+      </w:hyperlink>
+      <w:r>
+        <w:rPr>
+          <w:rFonts/>
+        </w:rPr>
+        <w:t>若目标瓶颈是网络等待或独立操作串行，则还应做普通缓存和并行对照；这是系统优化方向，不能用上述文献的成功率为其效果背书。</w:t>
+      </w:r>
+    </w:p>
+    <w:p>
+      <w:r>
+        <w:rPr>
+          <w:rFonts/>
+        </w:rPr>
+        <w:t>这里所谓“稳妥”，是指机制已有多个独立工作支持、对照容易搭建、失败也能产生清楚结论；不是文献数量上的流行度统计，更不是保证会在我们的任务上加速。按当前证据，先做文字记忆、程序技能和轻量环境说明的受控比较，比一开始启动完整自演化框架更便于判断投入产出。</w:t>
+      </w:r>
+    </w:p>
+    <w:p>
+      <w:pPr>
+        <w:pStyle w:val="Heading2"/>
+      </w:pPr>
+      <w:r>
+        <w:rPr>
+          <w:rFonts/>
+        </w:rPr>
+        <w:t>评价同时保留三份账</w:t>
+      </w:r>
+    </w:p>
+    <w:p>
+      <w:r>
+        <w:rPr>
+          <w:rFonts/>
+        </w:rPr>
+        <w:t>构造账包括生成历史轨迹、额外探索、反思、写工具与依赖准备；选择账包括候选比较、回归测试和被拒绝修改；执行账包括检索、技能匹配、常规模型调用、环境开销和失败回退。维护成本另列，不计入构造账，以便统计环境变化的代价。历史轨迹如果是既有业务自然产生，可以另报“已有日志可用”的增量场景，但不能把它与从零生成日志的场景混在一起。</w:t>
+      </w:r>
+    </w:p>
+    <w:p>
+      <w:r>
+        <w:rPr>
+          <w:rFonts/>
+        </w:rPr>
         <w:t>下面是本报告的核算定义，不是某篇论文的公式：</w:t>
+      </w:r>
+    </w:p>
+    <w:p>
+      <w:r>
+        <w:rPr>
+          <w:rFonts/>
+        </w:rPr>
+        <w:t>可先把选择问题写为：</w:t>
+      </w:r>
+      <w:r>
+        <w:rPr>
+          <w:rFonts w:ascii="Consolas" w:hAnsi="Consolas"/>
+          <w:sz w:val="21"/>
+        </w:rPr>
+        <w:t>最小化系统在任务流上的总费用 Cost_total(Σ)</w:t>
+      </w:r>
+      <w:r>
+        <w:rPr>
+          <w:rFonts/>
+        </w:rPr>
+        <w:t>，约束为</w:t>
+      </w:r>
+      <w:r>
+        <w:rPr>
+          <w:rFonts w:ascii="Consolas" w:hAnsi="Consolas"/>
+          <w:sz w:val="21"/>
+        </w:rPr>
+        <w:t>Quality(Σ) ≥ Quality(Σ_base) − ε</w:t>
+      </w:r>
+      <w:r>
+        <w:rPr>
+          <w:rFonts/>
+        </w:rPr>
+        <w:t>及</w:t>
+      </w:r>
+      <w:r>
+        <w:rPr>
+          <w:rFonts w:ascii="Consolas" w:hAnsi="Consolas"/>
+          <w:sz w:val="21"/>
+        </w:rPr>
+        <w:t>Latency_p95(Σ) ≤ L_limit</w:t>
+      </w:r>
+      <w:r>
+        <w:rPr>
+          <w:rFonts/>
+        </w:rPr>
+        <w:t>。Σ是可修改的外部系统，Σ_base是基线，Quality由预先固定的业务标准评定，ε是预先约定的可接受差异，L_limit是时延要求。费用、时延和质量都在相同任务流、固定模型与权限下测量；ε与L_limit需要实验前确定，不能看结果后调整。如果还没有业务阈值，就先报告质量、时间、费用的联合比较，不把不同单位随意相加为一个“效率分”。</w:t>
       </w:r>
     </w:p>
     <w:p>
@@ -4080,7 +6439,7 @@
         </w:rPr>
         <w:t>。配套</w:t>
       </w:r>
-      <w:hyperlink r:id="rId52">
+      <w:hyperlink r:id="rId67">
         <w:r>
           <w:rPr>
             <w:rFonts w:ascii="Arial" w:hAnsi="Arial" w:eastAsia="Songti SC"/>
@@ -4125,7 +6484,7 @@
         </w:rPr>
         <w:t xml:space="preserve"> Nature 639:609–616, 2025. DOI:10.1038/s41586-025-08661-4. </w:t>
       </w:r>
-      <w:hyperlink r:id="rId53">
+      <w:hyperlink r:id="rId68">
         <w:r>
           <w:rPr>
             <w:rFonts w:ascii="Arial" w:hAnsi="Arial" w:eastAsia="Songti SC"/>
@@ -4170,7 +6529,7 @@
         </w:rPr>
         <w:t xml:space="preserve">[3] Ching-An Cheng, Allen Nie, Adith Swaminathan. Trace is the Next AutoDiff: Generative Optimization with Rich Feedback, Execution Traces, and LLMs. NeurIPS, 2024. arXiv:2406.16218v2. </w:t>
       </w:r>
-      <w:hyperlink r:id="rId54">
+      <w:hyperlink r:id="rId69">
         <w:r>
           <w:rPr>
             <w:rFonts w:ascii="Arial" w:hAnsi="Arial" w:eastAsia="Songti SC"/>
@@ -4193,7 +6552,7 @@
         </w:rPr>
         <w:t xml:space="preserve">[4] Lakshya A. Agrawal, Shangyin Tan, Dilara Soylu, Noah Ziems, Rishi Khare, Krista Opsahl-Ong, Arnav Singhvi, Herumb Shandilya, Michael J. Ryan, Meng Jiang, Christopher Potts, Koushik Sen, Alexandros G. Dimakis, Ion Stoica, Dan Klein, Matei Zaharia, Omar Khattab. GEPA: Reflective Prompt Evolution Can Outperform Reinforcement Learning. ICLR, 2026. arXiv:2507.19457v2. </w:t>
       </w:r>
-      <w:hyperlink r:id="rId55">
+      <w:hyperlink r:id="rId70">
         <w:r>
           <w:rPr>
             <w:rFonts w:ascii="Arial" w:hAnsi="Arial" w:eastAsia="Songti SC"/>
@@ -4216,7 +6575,7 @@
         </w:rPr>
         <w:t xml:space="preserve">[5] Yifan Yang, Ziyang Gong, Weiquan Huang, Qihao Yang, Ziwei Zhou, Zisu Huang, Yan Li, Xuemei Gao, Qi Dai, Bei Liu, Kai Qiu, Yuqing Yang, Dongdong Chen, Xue Yang, Chong Luo. SkillOpt: Executive Strategy for Self-Evolving Agent Skills. 2026. arXiv:2605.23904v2. </w:t>
       </w:r>
-      <w:hyperlink r:id="rId56">
+      <w:hyperlink r:id="rId71">
         <w:r>
           <w:rPr>
             <w:rFonts w:ascii="Arial" w:hAnsi="Arial" w:eastAsia="Songti SC"/>
@@ -4239,7 +6598,7 @@
         </w:rPr>
         <w:t xml:space="preserve">[6] Qizheng Zhang, Changran Hu, Shubhangi Upasani, Boyuan Ma, Fenglu Hong, Vamsidhar Kamanuru, Jay Rainton, Chen Wu, Mengmeng Ji, Hanchen Li, Urmish Thakker, James Zou, Kunle Olukotun. Agentic Context Engineering: Evolving Contexts for Self-Improving Language Models. ICLR, 2026. arXiv:2510.04618v3. </w:t>
       </w:r>
-      <w:hyperlink r:id="rId57">
+      <w:hyperlink r:id="rId72">
         <w:r>
           <w:rPr>
             <w:rFonts w:ascii="Arial" w:hAnsi="Arial" w:eastAsia="Songti SC"/>
@@ -4262,7 +6621,7 @@
         </w:rPr>
         <w:t xml:space="preserve">[7] Zhanzhi Lou, Hui Chen, Yibo Li, Qian Wang, Bryan Hooi. Meta-TTL: Meta-Learning Self-Improvement Policies for Language Agents. 2026. arXiv:2604.00830v4. </w:t>
       </w:r>
-      <w:hyperlink r:id="rId58">
+      <w:hyperlink r:id="rId73">
         <w:r>
           <w:rPr>
             <w:rFonts w:ascii="Arial" w:hAnsi="Arial" w:eastAsia="Songti SC"/>
@@ -4285,7 +6644,7 @@
         </w:rPr>
         <w:t xml:space="preserve">[8] Igor Bogdanov, Chung-Horng Lung, Thomas Kunz, Jie Gao, Adrian Taylor, Marzia Zaman. FORGE: Self-Evolving Agent Memory With No Weight Updates via Population Broadcast. ACM Conference on AI and Agentic Systems, 2026. DOI:10.1145/3786335.3813155. </w:t>
       </w:r>
-      <w:hyperlink r:id="rId59">
+      <w:hyperlink r:id="rId74">
         <w:r>
           <w:rPr>
             <w:rFonts w:ascii="Arial" w:hAnsi="Arial" w:eastAsia="Songti SC"/>
@@ -4308,7 +6667,7 @@
         </w:rPr>
         <w:t xml:space="preserve">[9] Yunhao Yang, Neel P. Bhatt, Kevin Wang, Samuel Tetteh, Zhangyang Wang, Ufuk Topcu. VASO: Formally Verifiable Self-Evolving Skills for Physical AI Agents. 2026. arXiv:2606.05395v1. </w:t>
       </w:r>
-      <w:hyperlink r:id="rId60">
+      <w:hyperlink r:id="rId75">
         <w:r>
           <w:rPr>
             <w:rFonts w:ascii="Arial" w:hAnsi="Arial" w:eastAsia="Songti SC"/>
@@ -4331,7 +6690,7 @@
         </w:rPr>
         <w:t xml:space="preserve">[10] Minsoo Kim, Seung-won Hwang. Dual-Scale World Models for LLM Agents Towards Hard-Exploration Problems. 2025. arXiv:2509.24116v2. </w:t>
       </w:r>
-      <w:hyperlink r:id="rId61">
+      <w:hyperlink r:id="rId76">
         <w:r>
           <w:rPr>
             <w:rFonts w:ascii="Arial" w:hAnsi="Arial" w:eastAsia="Songti SC"/>
@@ -4354,7 +6713,7 @@
         </w:rPr>
         <w:t xml:space="preserve">[11] Xuan Zhang, Wenxuan Zhang, See-Kiong Ng, Yang Deng. Self-Evolving World Models for LLM Agent Planning. 2026. arXiv:2606.30639v2. </w:t>
       </w:r>
-      <w:hyperlink r:id="rId62">
+      <w:hyperlink r:id="rId77">
         <w:r>
           <w:rPr>
             <w:rFonts w:ascii="Arial" w:hAnsi="Arial" w:eastAsia="Songti SC"/>
@@ -4482,7 +6841,7 @@
         </w:rPr>
         <w:t xml:space="preserve">. 预印本（2025）. 所读/核查版本：arXiv:2509.25140v2. </w:t>
       </w:r>
-      <w:hyperlink r:id="rId63">
+      <w:hyperlink r:id="rId78">
         <w:r>
           <w:rPr>
             <w:rFonts w:ascii="Arial" w:hAnsi="Arial" w:eastAsia="Songti SC"/>
@@ -4527,7 +6886,7 @@
         </w:rPr>
         <w:t xml:space="preserve">. Proceedings of the AAAI Conference on Artificial Intelligence 38(17):19632–19642, 2024. 所读/核查版本：arXiv:2308.10144v3. </w:t>
       </w:r>
-      <w:hyperlink r:id="rId64">
+      <w:hyperlink r:id="rId79">
         <w:r>
           <w:rPr>
             <w:rFonts w:ascii="Arial" w:hAnsi="Arial" w:eastAsia="Songti SC"/>
@@ -4543,7 +6902,7 @@
         </w:rPr>
         <w:t>。</w:t>
       </w:r>
-      <w:hyperlink r:id="rId65">
+      <w:hyperlink r:id="rId80">
         <w:r>
           <w:rPr>
             <w:rFonts w:ascii="Arial" w:hAnsi="Arial" w:eastAsia="Songti SC"/>
@@ -4581,7 +6940,7 @@
         </w:rPr>
         <w:t xml:space="preserve">. 预印本（2026）. 所读/核查版本：arXiv:2601.03192v2. </w:t>
       </w:r>
-      <w:hyperlink r:id="rId66">
+      <w:hyperlink r:id="rId81">
         <w:r>
           <w:rPr>
             <w:rFonts w:ascii="Arial" w:hAnsi="Arial" w:eastAsia="Songti SC"/>
@@ -4626,7 +6985,7 @@
         </w:rPr>
         <w:t xml:space="preserve">. 预印本（2026）. 所读/核查版本：arXiv:2606.24151v1. </w:t>
       </w:r>
-      <w:hyperlink r:id="rId67">
+      <w:hyperlink r:id="rId82">
         <w:r>
           <w:rPr>
             <w:rFonts w:ascii="Arial" w:hAnsi="Arial" w:eastAsia="Songti SC"/>
@@ -4671,7 +7030,7 @@
         </w:rPr>
         <w:t xml:space="preserve">. ACM MobiCom 2024. 所读/核查版本：arXiv:2312.03003v3. </w:t>
       </w:r>
-      <w:hyperlink r:id="rId68">
+      <w:hyperlink r:id="rId83">
         <w:r>
           <w:rPr>
             <w:rFonts w:ascii="Arial" w:hAnsi="Arial" w:eastAsia="Songti SC"/>
@@ -4762,7 +7121,7 @@
         </w:rPr>
         <w:t xml:space="preserve">; </w:t>
       </w:r>
-      <w:hyperlink r:id="rId69">
+      <w:hyperlink r:id="rId84">
         <w:r>
           <w:rPr>
             <w:rFonts w:ascii="Arial" w:hAnsi="Arial" w:eastAsia="Songti SC"/>
@@ -5213,7 +7572,7 @@
         </w:rPr>
         <w:t xml:space="preserve">; </w:t>
       </w:r>
-      <w:hyperlink r:id="rId70">
+      <w:hyperlink r:id="rId85">
         <w:r>
           <w:rPr>
             <w:rFonts w:ascii="Arial" w:hAnsi="Arial" w:eastAsia="Songti SC"/>
@@ -5304,7 +7663,7 @@
         </w:rPr>
         <w:t xml:space="preserve">; </w:t>
       </w:r>
-      <w:hyperlink r:id="rId71">
+      <w:hyperlink r:id="rId86">
         <w:r>
           <w:rPr>
             <w:rFonts w:ascii="Arial" w:hAnsi="Arial" w:eastAsia="Songti SC"/>
@@ -5484,7 +7843,7 @@
         </w:rPr>
         <w:t xml:space="preserve"> Emory/Amazon/Penn State/UIUC/Northeastern preprint,2026. 实读</w:t>
       </w:r>
-      <w:hyperlink r:id="rId45">
+      <w:hyperlink r:id="rId47">
         <w:r>
           <w:rPr>
             <w:rFonts w:ascii="Arial" w:hAnsi="Arial" w:eastAsia="Songti SC"/>
@@ -5529,7 +7888,7 @@
         </w:rPr>
         <w:t xml:space="preserve"> Princeton/ARISE Foundation/Google DeepMind preprint,2026. 实读</w:t>
       </w:r>
-      <w:hyperlink r:id="rId46">
+      <w:hyperlink r:id="rId48">
         <w:r>
           <w:rPr>
             <w:rFonts w:ascii="Arial" w:hAnsi="Arial" w:eastAsia="Songti SC"/>
@@ -5574,7 +7933,7 @@
         </w:rPr>
         <w:t xml:space="preserve"> UIUC preprint,2025. 实读</w:t>
       </w:r>
-      <w:hyperlink r:id="rId47">
+      <w:hyperlink r:id="rId49">
         <w:r>
           <w:rPr>
             <w:rFonts w:ascii="Arial" w:hAnsi="Arial" w:eastAsia="Songti SC"/>
@@ -5619,7 +7978,7 @@
         </w:rPr>
         <w:t xml:space="preserve"> ICLR2026，</w:t>
       </w:r>
-      <w:hyperlink r:id="rId72">
+      <w:hyperlink r:id="rId87">
         <w:r>
           <w:rPr>
             <w:rFonts w:ascii="Arial" w:hAnsi="Arial" w:eastAsia="Songti SC"/>
@@ -5635,7 +7994,7 @@
         </w:rPr>
         <w:t>。实读</w:t>
       </w:r>
-      <w:hyperlink r:id="rId48">
+      <w:hyperlink r:id="rId50">
         <w:r>
           <w:rPr>
             <w:rFonts w:ascii="Arial" w:hAnsi="Arial" w:eastAsia="Songti SC"/>
@@ -5680,7 +8039,7 @@
         </w:rPr>
         <w:t xml:space="preserve"> ICLR2026, main conference poster. </w:t>
       </w:r>
-      <w:hyperlink r:id="rId73">
+      <w:hyperlink r:id="rId88">
         <w:r>
           <w:rPr>
             <w:rFonts w:ascii="Arial" w:hAnsi="Arial" w:eastAsia="Songti SC"/>
@@ -5696,7 +8055,7 @@
         </w:rPr>
         <w:t>。实读</w:t>
       </w:r>
-      <w:hyperlink r:id="rId49">
+      <w:hyperlink r:id="rId51">
         <w:r>
           <w:rPr>
             <w:rFonts w:ascii="Arial" w:hAnsi="Arial" w:eastAsia="Songti SC"/>
@@ -5741,7 +8100,7 @@
         </w:rPr>
         <w:t xml:space="preserve"> Fudan University preprint,2026. 实读</w:t>
       </w:r>
-      <w:hyperlink r:id="rId50">
+      <w:hyperlink r:id="rId52">
         <w:r>
           <w:rPr>
             <w:rFonts w:ascii="Arial" w:hAnsi="Arial" w:eastAsia="Songti SC"/>
@@ -5832,7 +8191,7 @@
         </w:rPr>
         <w:t xml:space="preserve">; </w:t>
       </w:r>
-      <w:hyperlink r:id="rId74">
+      <w:hyperlink r:id="rId89">
         <w:r>
           <w:rPr>
             <w:rFonts w:ascii="Arial" w:hAnsi="Arial" w:eastAsia="Songti SC"/>
@@ -6027,6 +8386,801 @@
           <w:sz w:val="20"/>
         </w:rPr>
         <w:t>。使用用户提供的中文自动字幕作为线索，不作为实验结果的一手来源。</w:t>
+      </w:r>
+    </w:p>
+    <w:p>
+      <w:pPr>
+        <w:keepLines/>
+        <w:spacing w:line="271" w:lineRule="auto" w:after="160"/>
+        <w:ind w:left="432" w:hanging="432"/>
+      </w:pPr>
+      <w:r>
+        <w:rPr>
+          <w:rFonts/>
+          <w:sz w:val="20"/>
+        </w:rPr>
+        <w:t xml:space="preserve">[42] Harsh Trivedi, Tushar Khot, Mareike Hartmann, Ruskin Manku, Vinty Dong, Edward Li, Shashank Gupta, Ashish Sabharwal, and Niranjan Balasubramanian. </w:t>
+      </w:r>
+      <w:r>
+        <w:rPr>
+          <w:rFonts/>
+          <w:b/>
+          <w:sz w:val="20"/>
+        </w:rPr>
+        <w:t>AppWorld: A Controllable World of Apps and People for Benchmarking Interactive Coding Agents.</w:t>
+      </w:r>
+      <w:r>
+        <w:rPr>
+          <w:rFonts/>
+          <w:sz w:val="20"/>
+        </w:rPr>
+        <w:t xml:space="preserve"> Proceedings of the 62nd Annual Meeting of the Association for Computational Linguistics (Volume 1: Long Papers), pp.16022–16076, 2024. DOI:10.18653/v1/2024.acl-long.850. </w:t>
+      </w:r>
+      <w:hyperlink r:id="rId55">
+        <w:r>
+          <w:rPr>
+            <w:rFonts w:ascii="Arial" w:hAnsi="Arial" w:eastAsia="Songti SC"/>
+            <w:color w:val="185A8D"/>
+          </w:rPr>
+          <w:t>正式页及实际读本</w:t>
+        </w:r>
+      </w:hyperlink>
+      <w:r>
+        <w:rPr>
+          <w:rFonts/>
+          <w:sz w:val="20"/>
+        </w:rPr>
+        <w:t>。</w:t>
+      </w:r>
+    </w:p>
+    <w:p>
+      <w:pPr>
+        <w:keepLines/>
+        <w:spacing w:line="271" w:lineRule="auto" w:after="160"/>
+        <w:ind w:left="432" w:hanging="432"/>
+      </w:pPr>
+      <w:r>
+        <w:rPr>
+          <w:rFonts/>
+          <w:sz w:val="20"/>
+        </w:rPr>
+        <w:t xml:space="preserve">[43] Alexandre Drouin, Maxime Gasse, Massimo Caccia, Issam H. Laradji, Manuel Del Verme, Tom Marty, David Vazquez, Nicolas Chapados, and Alexandre Lacoste. </w:t>
+      </w:r>
+      <w:r>
+        <w:rPr>
+          <w:rFonts/>
+          <w:b/>
+          <w:sz w:val="20"/>
+        </w:rPr>
+        <w:t>WorkArena: How Capable are Web Agents at Solving Common Knowledge Work Tasks?</w:t>
+      </w:r>
+      <w:r>
+        <w:rPr>
+          <w:rFonts/>
+          <w:sz w:val="20"/>
+        </w:rPr>
+        <w:t xml:space="preserve"> Proceedings of the 41st International Conference on Machine Learning, PMLR235:11642–11662, 2024. </w:t>
+      </w:r>
+      <w:hyperlink r:id="rId56">
+        <w:r>
+          <w:rPr>
+            <w:rFonts w:ascii="Arial" w:hAnsi="Arial" w:eastAsia="Songti SC"/>
+            <w:color w:val="185A8D"/>
+          </w:rPr>
+          <w:t>正式页</w:t>
+        </w:r>
+      </w:hyperlink>
+      <w:r>
+        <w:rPr>
+          <w:rFonts/>
+          <w:sz w:val="20"/>
+        </w:rPr>
+        <w:t>，</w:t>
+      </w:r>
+      <w:hyperlink r:id="rId90">
+        <w:r>
+          <w:rPr>
+            <w:rFonts w:ascii="Arial" w:hAnsi="Arial" w:eastAsia="Songti SC"/>
+            <w:color w:val="185A8D"/>
+          </w:rPr>
+          <w:t>实际阅读正式PDF</w:t>
+        </w:r>
+      </w:hyperlink>
+      <w:r>
+        <w:rPr>
+          <w:rFonts/>
+          <w:sz w:val="20"/>
+        </w:rPr>
+        <w:t>。2024原版，不混后续WorkArena++。</w:t>
+      </w:r>
+    </w:p>
+    <w:p>
+      <w:pPr>
+        <w:keepLines/>
+        <w:spacing w:line="271" w:lineRule="auto" w:after="160"/>
+        <w:ind w:left="432" w:hanging="432"/>
+      </w:pPr>
+      <w:r>
+        <w:rPr>
+          <w:rFonts/>
+          <w:sz w:val="20"/>
+        </w:rPr>
+        <w:t xml:space="preserve">[44] Shuyan Zhou, Frank F. Xu, Hao Zhu, Xuhui Zhou, Robert Lo, Abishek Sridhar, Xianyi Cheng, Tianyue Ou, Yonatan Bisk, Daniel Fried, Uri Alon, and Graham Neubig. </w:t>
+      </w:r>
+      <w:r>
+        <w:rPr>
+          <w:rFonts/>
+          <w:b/>
+          <w:sz w:val="20"/>
+        </w:rPr>
+        <w:t>WebArena: A Realistic Web Environment for Building Autonomous Agents.</w:t>
+      </w:r>
+      <w:r>
+        <w:rPr>
+          <w:rFonts/>
+          <w:sz w:val="20"/>
+        </w:rPr>
+        <w:t xml:space="preserve"> ICLR, 2024. </w:t>
+      </w:r>
+      <w:hyperlink r:id="rId91">
+        <w:r>
+          <w:rPr>
+            <w:rFonts w:ascii="Arial" w:hAnsi="Arial" w:eastAsia="Songti SC"/>
+            <w:color w:val="185A8D"/>
+          </w:rPr>
+          <w:t>正式录</w:t>
+        </w:r>
+      </w:hyperlink>
+      <w:r>
+        <w:rPr>
+          <w:rFonts/>
+          <w:sz w:val="20"/>
+        </w:rPr>
+        <w:t>。实际阅读</w:t>
+      </w:r>
+      <w:hyperlink r:id="rId57">
+        <w:r>
+          <w:rPr>
+            <w:rFonts w:ascii="Arial" w:hAnsi="Arial" w:eastAsia="Songti SC"/>
+            <w:color w:val="185A8D"/>
+          </w:rPr>
+          <w:t>arXiv:2307.13854v4</w:t>
+        </w:r>
+      </w:hyperlink>
+      <w:r>
+        <w:rPr>
+          <w:rFonts/>
+          <w:sz w:val="20"/>
+        </w:rPr>
+        <w:t>，2024-04-16。</w:t>
+      </w:r>
+    </w:p>
+    <w:p>
+      <w:pPr>
+        <w:keepLines/>
+        <w:spacing w:line="271" w:lineRule="auto" w:after="160"/>
+        <w:ind w:left="432" w:hanging="432"/>
+      </w:pPr>
+      <w:r>
+        <w:rPr>
+          <w:rFonts/>
+          <w:sz w:val="20"/>
+        </w:rPr>
+        <w:t xml:space="preserve">[45] Ido Levy, Ben Wiesel, Sami Marreed, Alon Oved, Avi Yaeli, and Segev Shlomov. </w:t>
+      </w:r>
+      <w:r>
+        <w:rPr>
+          <w:rFonts/>
+          <w:b/>
+          <w:sz w:val="20"/>
+        </w:rPr>
+        <w:t>ST-WebAgentBench: A Benchmark for Evaluating Safety and Trustworthiness in Web Agents.</w:t>
+      </w:r>
+      <w:r>
+        <w:rPr>
+          <w:rFonts/>
+          <w:sz w:val="20"/>
+        </w:rPr>
+        <w:t xml:space="preserve"> ICLR, 2026. </w:t>
+      </w:r>
+      <w:hyperlink r:id="rId92">
+        <w:r>
+          <w:rPr>
+            <w:rFonts w:ascii="Arial" w:hAnsi="Arial" w:eastAsia="Songti SC"/>
+            <w:color w:val="185A8D"/>
+          </w:rPr>
+          <w:t>IBM正式出版记录</w:t>
+        </w:r>
+      </w:hyperlink>
+      <w:r>
+        <w:rPr>
+          <w:rFonts/>
+          <w:sz w:val="20"/>
+        </w:rPr>
+        <w:t>，</w:t>
+      </w:r>
+      <w:hyperlink r:id="rId87">
+        <w:r>
+          <w:rPr>
+            <w:rFonts w:ascii="Arial" w:hAnsi="Arial" w:eastAsia="Songti SC"/>
+            <w:color w:val="185A8D"/>
+          </w:rPr>
+          <w:t>ICLR官方会议录目录</w:t>
+        </w:r>
+      </w:hyperlink>
+      <w:r>
+        <w:rPr>
+          <w:rFonts/>
+          <w:sz w:val="20"/>
+        </w:rPr>
+        <w:t>。</w:t>
+      </w:r>
+      <w:r>
+        <w:rPr>
+          <w:rFonts/>
+          <w:b/>
+          <w:sz w:val="20"/>
+        </w:rPr>
+        <w:t>实际读的后续版本署名为</w:t>
+      </w:r>
+      <w:r>
+        <w:rPr>
+          <w:rFonts/>
+          <w:sz w:val="20"/>
+        </w:rPr>
+        <w:t xml:space="preserve"> Ido Levy, Ben Wiesel, Sami Marreed, Alon Oved, Avi Yaeli, Nir Mashkif, and Segev Shlomov，arXiv:2410.06703v7，2026-06-04，</w:t>
+      </w:r>
+      <w:hyperlink r:id="rId58">
+        <w:r>
+          <w:rPr>
+            <w:rFonts w:ascii="Arial" w:hAnsi="Arial" w:eastAsia="Songti SC"/>
+            <w:color w:val="185A8D"/>
+          </w:rPr>
+          <w:t>PDF</w:t>
+        </w:r>
+      </w:hyperlink>
+      <w:r>
+        <w:rPr>
+          <w:rFonts/>
+          <w:sz w:val="20"/>
+        </w:rPr>
+        <w:t>。本文375任务等数字来自后者；当前</w:t>
+      </w:r>
+      <w:hyperlink r:id="rId93">
+        <w:r>
+          <w:rPr>
+            <w:rFonts w:ascii="Arial" w:hAnsi="Arial" w:eastAsia="Songti SC"/>
+            <w:color w:val="185A8D"/>
+          </w:rPr>
+          <w:t>官方代码</w:t>
+        </w:r>
+      </w:hyperlink>
+      <w:r>
+        <w:rPr>
+          <w:rFonts/>
+          <w:sz w:val="20"/>
+        </w:rPr>
+        <w:t>补核反馈/重置模块。</w:t>
+      </w:r>
+    </w:p>
+    <w:p>
+      <w:pPr>
+        <w:keepLines/>
+        <w:spacing w:line="271" w:lineRule="auto" w:after="160"/>
+        <w:ind w:left="432" w:hanging="432"/>
+      </w:pPr>
+      <w:r>
+        <w:rPr>
+          <w:rFonts/>
+          <w:sz w:val="20"/>
+        </w:rPr>
+        <w:t xml:space="preserve">[46] Xiang Deng, Yu Gu, Boyuan Zheng, Shijie Chen, Sam Stevens, Boshi Wang, Huan Sun, and Yu Su. </w:t>
+      </w:r>
+      <w:r>
+        <w:rPr>
+          <w:rFonts/>
+          <w:b/>
+          <w:sz w:val="20"/>
+        </w:rPr>
+        <w:t>Mind2Web: Towards a Generalist Agent for the Web.</w:t>
+      </w:r>
+      <w:r>
+        <w:rPr>
+          <w:rFonts/>
+          <w:sz w:val="20"/>
+        </w:rPr>
+        <w:t xml:space="preserve"> Advances in Neural Information Processing Systems36, Datasets and Benchmarks Track, pp.28091–28114, 2023. </w:t>
+      </w:r>
+      <w:hyperlink r:id="rId94">
+        <w:r>
+          <w:rPr>
+            <w:rFonts w:ascii="Arial" w:hAnsi="Arial" w:eastAsia="Songti SC"/>
+            <w:color w:val="185A8D"/>
+          </w:rPr>
+          <w:t>正式录</w:t>
+        </w:r>
+      </w:hyperlink>
+      <w:r>
+        <w:rPr>
+          <w:rFonts/>
+          <w:sz w:val="20"/>
+        </w:rPr>
+        <w:t>。实际阅读</w:t>
+      </w:r>
+      <w:hyperlink r:id="rId61">
+        <w:r>
+          <w:rPr>
+            <w:rFonts w:ascii="Arial" w:hAnsi="Arial" w:eastAsia="Songti SC"/>
+            <w:color w:val="185A8D"/>
+          </w:rPr>
+          <w:t>arXiv:2306.06070v3</w:t>
+        </w:r>
+      </w:hyperlink>
+      <w:r>
+        <w:rPr>
+          <w:rFonts/>
+          <w:sz w:val="20"/>
+        </w:rPr>
+        <w:t>，2023-12-09；该PDF姓名写Samuel Stevens。</w:t>
+      </w:r>
+    </w:p>
+    <w:p>
+      <w:pPr>
+        <w:keepLines/>
+        <w:spacing w:line="271" w:lineRule="auto" w:after="160"/>
+        <w:ind w:left="432" w:hanging="432"/>
+      </w:pPr>
+      <w:r>
+        <w:rPr>
+          <w:rFonts/>
+          <w:sz w:val="20"/>
+        </w:rPr>
+        <w:t xml:space="preserve">[47] Xing Han Lu, Zdeněk Kasner, and Siva Reddy. </w:t>
+      </w:r>
+      <w:r>
+        <w:rPr>
+          <w:rFonts/>
+          <w:b/>
+          <w:sz w:val="20"/>
+        </w:rPr>
+        <w:t>WebLINX: Real-World Website Navigation with Multi-Turn Dialogue.</w:t>
+      </w:r>
+      <w:r>
+        <w:rPr>
+          <w:rFonts/>
+          <w:sz w:val="20"/>
+        </w:rPr>
+        <w:t xml:space="preserve"> Proceedings of the 41st International Conference on Machine Learning, PMLR235:33007–33056, 2024. </w:t>
+      </w:r>
+      <w:hyperlink r:id="rId62">
+        <w:r>
+          <w:rPr>
+            <w:rFonts w:ascii="Arial" w:hAnsi="Arial" w:eastAsia="Songti SC"/>
+            <w:color w:val="185A8D"/>
+          </w:rPr>
+          <w:t>正式页</w:t>
+        </w:r>
+      </w:hyperlink>
+      <w:r>
+        <w:rPr>
+          <w:rFonts/>
+          <w:sz w:val="20"/>
+        </w:rPr>
+        <w:t>，</w:t>
+      </w:r>
+      <w:hyperlink r:id="rId95">
+        <w:r>
+          <w:rPr>
+            <w:rFonts w:ascii="Arial" w:hAnsi="Arial" w:eastAsia="Songti SC"/>
+            <w:color w:val="185A8D"/>
+          </w:rPr>
+          <w:t>实际阅读正式PDF</w:t>
+        </w:r>
+      </w:hyperlink>
+      <w:r>
+        <w:rPr>
+          <w:rFonts/>
+          <w:sz w:val="20"/>
+        </w:rPr>
+        <w:t>。作者个人常用拼写Xing Han Lù；引用按PMLR书目。</w:t>
+      </w:r>
+    </w:p>
+    <w:p>
+      <w:pPr>
+        <w:keepLines/>
+        <w:spacing w:line="271" w:lineRule="auto" w:after="160"/>
+        <w:ind w:left="432" w:hanging="432"/>
+      </w:pPr>
+      <w:r>
+        <w:rPr>
+          <w:rFonts/>
+          <w:sz w:val="20"/>
+        </w:rPr>
+        <w:t xml:space="preserve">[48] Tianbao Xie, Danyang Zhang, Jixuan Chen, Xiaochuan Li, Siheng Zhao, Ruisheng Cao, Toh Jing Hua, Zhoujun Cheng, Dongchan Shin, Fangyu Lei, Yitao Liu, Yiheng Xu, Shuyan Zhou, Silvio Savarese, Caiming Xiong, Victor Zhong, and Tao Yu. </w:t>
+      </w:r>
+      <w:r>
+        <w:rPr>
+          <w:rFonts/>
+          <w:b/>
+          <w:sz w:val="20"/>
+        </w:rPr>
+        <w:t>OSWorld: Benchmarking Multimodal Agents for Open-Ended Tasks in Real Computer Environments.</w:t>
+      </w:r>
+      <w:r>
+        <w:rPr>
+          <w:rFonts/>
+          <w:sz w:val="20"/>
+        </w:rPr>
+        <w:t xml:space="preserve"> Advances in Neural Information Processing Systems37, Datasets and Benchmarks Track, 2024. </w:t>
+      </w:r>
+      <w:hyperlink r:id="rId96">
+        <w:r>
+          <w:rPr>
+            <w:rFonts w:ascii="Arial" w:hAnsi="Arial" w:eastAsia="Songti SC"/>
+            <w:color w:val="185A8D"/>
+          </w:rPr>
+          <w:t>正式会议PDF</w:t>
+        </w:r>
+      </w:hyperlink>
+      <w:r>
+        <w:rPr>
+          <w:rFonts/>
+          <w:sz w:val="20"/>
+        </w:rPr>
+        <w:t>。实际协议读本是较早</w:t>
+      </w:r>
+      <w:hyperlink r:id="rId64">
+        <w:r>
+          <w:rPr>
+            <w:rFonts w:ascii="Arial" w:hAnsi="Arial" w:eastAsia="Songti SC"/>
+            <w:color w:val="185A8D"/>
+          </w:rPr>
+          <w:t>arXiv:2404.07972v2</w:t>
+        </w:r>
+      </w:hyperlink>
+      <w:r>
+        <w:rPr>
+          <w:rFonts/>
+          <w:sz w:val="20"/>
+        </w:rPr>
+        <w:t>，2024-05-30；不声称等同后续Verified版本。</w:t>
+      </w:r>
+    </w:p>
+    <w:p>
+      <w:pPr>
+        <w:keepLines/>
+        <w:spacing w:line="271" w:lineRule="auto" w:after="160"/>
+        <w:ind w:left="432" w:hanging="432"/>
+      </w:pPr>
+      <w:r>
+        <w:rPr>
+          <w:rFonts/>
+          <w:sz w:val="20"/>
+        </w:rPr>
+        <w:t xml:space="preserve">[49] Yuxuan Zhang, Yubo Wang, Yipeng Zhu, Penghui Du, Junwen Miao, Xuan Lu, Zhuofeng Li, Xingwei Qu, Zhengkang Guo, Yuanzhe Shen, Dingjie Song, Han Zhou, Tuney Zheng, Xian Wu, Hao Yu, Songcheng Cai, Yi Lu, Yunzhuo Hao, Minyi Lei, Liang Chen, Kai Zou, Huifeng Yin, Wendong Xu, Dongfu Jiang, Ping Nie, Jiaheng Liu, Wenhu Chen, and Kelsey R. Allen. </w:t>
+      </w:r>
+      <w:r>
+        <w:rPr>
+          <w:rFonts/>
+          <w:b/>
+          <w:sz w:val="20"/>
+        </w:rPr>
+        <w:t>ClawBench: Can AI Agents Complete Everyday Online Tasks?</w:t>
+      </w:r>
+      <w:r>
+        <w:rPr>
+          <w:rFonts/>
+          <w:sz w:val="20"/>
+        </w:rPr>
+        <w:t xml:space="preserve"> arXiv:2604.08523v2, 2026-07-20. </w:t>
+      </w:r>
+      <w:hyperlink r:id="rId65">
+        <w:r>
+          <w:rPr>
+            <w:rFonts w:ascii="Arial" w:hAnsi="Arial" w:eastAsia="Songti SC"/>
+            <w:color w:val="185A8D"/>
+          </w:rPr>
+          <w:t>实际阅读PDF</w:t>
+        </w:r>
+      </w:hyperlink>
+      <w:r>
+        <w:rPr>
+          <w:rFonts/>
+          <w:sz w:val="20"/>
+        </w:rPr>
+        <w:t>，</w:t>
+      </w:r>
+      <w:hyperlink r:id="rId97">
+        <w:r>
+          <w:rPr>
+            <w:rFonts w:ascii="Arial" w:hAnsi="Arial" w:eastAsia="Songti SC"/>
+            <w:color w:val="185A8D"/>
+          </w:rPr>
+          <w:t>作者官方代码</w:t>
+        </w:r>
+      </w:hyperlink>
+      <w:r>
+        <w:rPr>
+          <w:rFonts/>
+          <w:sz w:val="20"/>
+        </w:rPr>
+        <w:t>，</w:t>
+      </w:r>
+      <w:hyperlink r:id="rId98">
+        <w:r>
+          <w:rPr>
+            <w:rFonts w:ascii="Arial" w:hAnsi="Arial" w:eastAsia="Songti SC"/>
+            <w:color w:val="185A8D"/>
+          </w:rPr>
+          <w:t>V1公开轨迹</w:t>
+        </w:r>
+      </w:hyperlink>
+      <w:r>
+        <w:rPr>
+          <w:rFonts/>
+          <w:sz w:val="20"/>
+        </w:rPr>
+        <w:t>。强机构preprint；repo自报EMNLP2026 Findings，未在本次独立确认正式录。</w:t>
+      </w:r>
+    </w:p>
+    <w:p>
+      <w:pPr>
+        <w:keepLines/>
+        <w:spacing w:line="271" w:lineRule="auto" w:after="160"/>
+        <w:ind w:left="432" w:hanging="432"/>
+      </w:pPr>
+      <w:r>
+        <w:rPr>
+          <w:rFonts/>
+          <w:sz w:val="20"/>
+        </w:rPr>
+        <w:t xml:space="preserve">[50] Peter Jansen, Marc-Alexandre Côté, Tushar Khot, Erin Bransom, Bhavana Dalvi Mishra, Bodhisattwa Prasad Majumder, Oyvind Tafjord, and Peter Clark. </w:t>
+      </w:r>
+      <w:r>
+        <w:rPr>
+          <w:rFonts/>
+          <w:b/>
+          <w:sz w:val="20"/>
+        </w:rPr>
+        <w:t>DiscoveryWorld: A Virtual Environment for Developing and Evaluating Automated Scientific Discovery Agents.</w:t>
+      </w:r>
+      <w:r>
+        <w:rPr>
+          <w:rFonts/>
+          <w:sz w:val="20"/>
+        </w:rPr>
+        <w:t xml:space="preserve"> Advances in Neural Information Processing Systems37, Datasets and Benchmarks Track, 2024. </w:t>
+      </w:r>
+      <w:hyperlink r:id="rId99">
+        <w:r>
+          <w:rPr>
+            <w:rFonts w:ascii="Arial" w:hAnsi="Arial" w:eastAsia="Songti SC"/>
+            <w:color w:val="185A8D"/>
+          </w:rPr>
+          <w:t>正式录</w:t>
+        </w:r>
+      </w:hyperlink>
+      <w:r>
+        <w:rPr>
+          <w:rFonts/>
+          <w:sz w:val="20"/>
+        </w:rPr>
+        <w:t>。实际阅读</w:t>
+      </w:r>
+      <w:hyperlink r:id="rId59">
+        <w:r>
+          <w:rPr>
+            <w:rFonts w:ascii="Arial" w:hAnsi="Arial" w:eastAsia="Songti SC"/>
+            <w:color w:val="185A8D"/>
+          </w:rPr>
+          <w:t>arXiv:2406.06769v2</w:t>
+        </w:r>
+      </w:hyperlink>
+      <w:r>
+        <w:rPr>
+          <w:rFonts/>
+          <w:sz w:val="20"/>
+        </w:rPr>
+        <w:t>，2024-10-07，首页仍标preprint，不改变已经独立核实的后续正式venue。</w:t>
+      </w:r>
+    </w:p>
+    <w:p>
+      <w:pPr>
+        <w:keepLines/>
+        <w:spacing w:line="271" w:lineRule="auto" w:after="160"/>
+        <w:ind w:left="432" w:hanging="432"/>
+      </w:pPr>
+      <w:r>
+        <w:rPr>
+          <w:rFonts/>
+          <w:sz w:val="20"/>
+        </w:rPr>
+        <w:t xml:space="preserve">[51] Yimeng Chen, Piotr Piękos, Mateusz Ostaszewski, Firas Laakom, and Jürgen Schmidhuber. </w:t>
+      </w:r>
+      <w:r>
+        <w:rPr>
+          <w:rFonts/>
+          <w:b/>
+          <w:sz w:val="20"/>
+        </w:rPr>
+        <w:t>PhysGym: Benchmarking LLMs in Interactive Physics Discovery with Controlled Priors.</w:t>
+      </w:r>
+      <w:r>
+        <w:rPr>
+          <w:rFonts/>
+          <w:sz w:val="20"/>
+        </w:rPr>
+        <w:t xml:space="preserve"> Advances in Neural Information Processing Systems38, Datasets and Benchmarks Track, 2025. </w:t>
+      </w:r>
+      <w:hyperlink r:id="rId100">
+        <w:r>
+          <w:rPr>
+            <w:rFonts w:ascii="Arial" w:hAnsi="Arial" w:eastAsia="Songti SC"/>
+            <w:color w:val="185A8D"/>
+          </w:rPr>
+          <w:t>正式录</w:t>
+        </w:r>
+      </w:hyperlink>
+      <w:r>
+        <w:rPr>
+          <w:rFonts/>
+          <w:sz w:val="20"/>
+        </w:rPr>
+        <w:t>。实际阅读</w:t>
+      </w:r>
+      <w:hyperlink r:id="rId60">
+        <w:r>
+          <w:rPr>
+            <w:rFonts w:ascii="Arial" w:hAnsi="Arial" w:eastAsia="Songti SC"/>
+            <w:color w:val="185A8D"/>
+          </w:rPr>
+          <w:t>arXiv:2507.15550v2</w:t>
+        </w:r>
+      </w:hyperlink>
+      <w:r>
+        <w:rPr>
+          <w:rFonts/>
+          <w:sz w:val="20"/>
+        </w:rPr>
+        <w:t>，2025-10-26。</w:t>
+      </w:r>
+    </w:p>
+    <w:p>
+      <w:pPr>
+        <w:keepLines/>
+        <w:spacing w:line="271" w:lineRule="auto" w:after="160"/>
+        <w:ind w:left="432" w:hanging="432"/>
+      </w:pPr>
+      <w:r>
+        <w:rPr>
+          <w:rFonts/>
+          <w:sz w:val="20"/>
+        </w:rPr>
+        <w:t xml:space="preserve">[52] Xingyao Wang, Zihan Wang, Jiateng Liu, Yangyi Chen, Lifan Yuan, Hao Peng, and Heng Ji. </w:t>
+      </w:r>
+      <w:r>
+        <w:rPr>
+          <w:rFonts/>
+          <w:b/>
+          <w:sz w:val="20"/>
+        </w:rPr>
+        <w:t>MINT: Evaluating LLMs in Multi-turn Interaction with Tools and Language Feedback.</w:t>
+      </w:r>
+      <w:r>
+        <w:rPr>
+          <w:rFonts/>
+          <w:sz w:val="20"/>
+        </w:rPr>
+        <w:t xml:space="preserve"> ICLR, 2024. </w:t>
+      </w:r>
+      <w:hyperlink r:id="rId101">
+        <w:r>
+          <w:rPr>
+            <w:rFonts w:ascii="Arial" w:hAnsi="Arial" w:eastAsia="Songti SC"/>
+            <w:color w:val="185A8D"/>
+          </w:rPr>
+          <w:t>正式录</w:t>
+        </w:r>
+      </w:hyperlink>
+      <w:r>
+        <w:rPr>
+          <w:rFonts/>
+          <w:sz w:val="20"/>
+        </w:rPr>
+        <w:t>。实际阅读</w:t>
+      </w:r>
+      <w:hyperlink r:id="rId63">
+        <w:r>
+          <w:rPr>
+            <w:rFonts w:ascii="Arial" w:hAnsi="Arial" w:eastAsia="Songti SC"/>
+            <w:color w:val="185A8D"/>
+          </w:rPr>
+          <w:t>作者发布的会议PDF</w:t>
+        </w:r>
+      </w:hyperlink>
+      <w:r>
+        <w:rPr>
+          <w:rFonts/>
+          <w:sz w:val="20"/>
+        </w:rPr>
+        <w:t>，首页标ICLR2024及arXiv:2309.10691v3，2024-03-12。</w:t>
+      </w:r>
+    </w:p>
+    <w:p>
+      <w:pPr>
+        <w:keepLines/>
+        <w:spacing w:line="271" w:lineRule="auto" w:after="160"/>
+        <w:ind w:left="432" w:hanging="432"/>
+      </w:pPr>
+      <w:r>
+        <w:rPr>
+          <w:rFonts/>
+          <w:sz w:val="20"/>
+        </w:rPr>
+        <w:t xml:space="preserve">[53] Jonathan Bragg, Mike D’Arcy, Nishant Balepur, Dan Bareket, Bhavana Dalvi, Sergey Feldman, Dany Haddad, Jena D. Hwang, Peter Jansen, Varsha Kishore, Bodhisattwa Prasad Majumder, Aakanksha Naik, Sigal Rahamimov, Kyle Richardson, Amanpreet Singh, Harshit Surana, Aryeh Tiktinsky, Rosni Vasu, Guy Wiener, Chloe Anastasiades, Stefan Candra, Jason Dunkelberger, Dan Emery, Rob Evans, Malachi Hamada, Regan Huff, Rodney Kinney, Matt Latzke, Jaron Lochner, Ruben Lozano-Aguilera, Cecile Nguyen, Smita Rao, Amber Tanaka, Brooke Vlahos, Peter Clark, Doug Downey, Yoav Goldberg, Ashish Sabharwal, and Daniel S. Weld. </w:t>
+      </w:r>
+      <w:r>
+        <w:rPr>
+          <w:rFonts/>
+          <w:b/>
+          <w:sz w:val="20"/>
+        </w:rPr>
+        <w:t>AstaBench: Rigorous Benchmarking of AI Agents with a Scientific Research Suite.</w:t>
+      </w:r>
+      <w:r>
+        <w:rPr>
+          <w:rFonts/>
+          <w:sz w:val="20"/>
+        </w:rPr>
+        <w:t xml:space="preserve"> ICLR, 2026. </w:t>
+      </w:r>
+      <w:hyperlink r:id="rId102">
+        <w:r>
+          <w:rPr>
+            <w:rFonts w:ascii="Arial" w:hAnsi="Arial" w:eastAsia="Songti SC"/>
+            <w:color w:val="185A8D"/>
+          </w:rPr>
+          <w:t>OpenReview论文页</w:t>
+        </w:r>
+      </w:hyperlink>
+      <w:r>
+        <w:rPr>
+          <w:rFonts/>
+          <w:sz w:val="20"/>
+        </w:rPr>
+        <w:t>，</w:t>
+      </w:r>
+      <w:hyperlink r:id="rId87">
+        <w:r>
+          <w:rPr>
+            <w:rFonts w:ascii="Arial" w:hAnsi="Arial" w:eastAsia="Songti SC"/>
+            <w:color w:val="185A8D"/>
+          </w:rPr>
+          <w:t>ICLR官方录目录</w:t>
+        </w:r>
+      </w:hyperlink>
+      <w:r>
+        <w:rPr>
+          <w:rFonts/>
+          <w:sz w:val="20"/>
+        </w:rPr>
+        <w:t>。实际阅读</w:t>
+      </w:r>
+      <w:hyperlink r:id="rId66">
+        <w:r>
+          <w:rPr>
+            <w:rFonts w:ascii="Arial" w:hAnsi="Arial" w:eastAsia="Songti SC"/>
+            <w:color w:val="185A8D"/>
+          </w:rPr>
+          <w:t>arXiv:2510.21652v2</w:t>
+        </w:r>
+      </w:hyperlink>
+      <w:r>
+        <w:rPr>
+          <w:rFonts/>
+          <w:sz w:val="20"/>
+        </w:rPr>
+        <w:t>，2026-04-21。</w:t>
       </w:r>
     </w:p>
     <w:sectPr>

</xml_diff>